<commit_message>
101 front page and 444.02
</commit_message>
<xml_diff>
--- a/F26-Phil101-site/syllabus-F26-101.docx
+++ b/F26-Phil101-site/syllabus-F26-101.docx
@@ -399,7 +399,7 @@
         <w:pStyle w:val="BodyText"/>
       </w:pPr>
       <w:r>
-        <w:t xml:space="preserve">Readings are short by design. Most weeks ask for under 5,000 words. Three days in the term are heavier, and they are marked in the schedule below.</w:t>
+        <w:t xml:space="preserve">Readings are short by design. Most weeks ask for under 5,000 words (about 10-15 pages of a normal book), though there are a couple of heavier days.</w:t>
       </w:r>
     </w:p>
     <w:p>
@@ -407,7 +407,7 @@
         <w:pStyle w:val="BodyText"/>
       </w:pPr>
       <w:r>
-        <w:t xml:space="preserve">You will need an iclicker or the iclicker app for this course, since reading quizzes are answered in lecture. Details will be on Canvas before the first class.</w:t>
+        <w:t xml:space="preserve">You will need an iClicker or the iClicker app for this course, since reading quizzes are answered in lecture. Details will be on Canvas before the first class.</w:t>
       </w:r>
     </w:p>
     <w:bookmarkEnd w:id="15"/>
@@ -466,7 +466,7 @@
               <w:pStyle w:val="Compact"/>
             </w:pPr>
             <w:r>
-              <w:t xml:space="preserve">Reading quizzes in lecture, best 15 of about 20</w:t>
+              <w:t xml:space="preserve">Reading quizzes in lecture, best 15 of 20</w:t>
             </w:r>
           </w:p>
         </w:tc>
@@ -730,7 +730,7 @@
           <w:b/>
           <w:bCs/>
         </w:rPr>
-        <w:t xml:space="preserve">WE NEED TO DISCUSS WHAT GOES HERE BEFORE DISTIBUTING TO THE STTUDENTS</w:t>
+        <w:t xml:space="preserve">WE NEED TO DISCUSS WHAT GOES HERE BEFORE DISTRIBUTING TO THE STUDENTS</w:t>
       </w:r>
     </w:p>
     <w:p>
@@ -802,7 +802,7 @@
         <w:t xml:space="preserve"> </w:t>
       </w:r>
       <w:r>
-        <w:t xml:space="preserve">About 1,200 words on a question in ethics or welfare, due Monday 23 November. The essay shoudl have a similar structure to Short Answer 2. We will get comments back to you on Short Answer 2 well before this is due.</w:t>
+        <w:t xml:space="preserve">About 1,200 words on a question in ethics or welfare, due Monday 23 November. The essay should have a similar structure to Short Answer 2. We will get comments back to you on Short Answer 2 well before this is due.</w:t>
       </w:r>
     </w:p>
     <w:p>
@@ -820,7 +820,7 @@
         <w:t xml:space="preserve"> </w:t>
       </w:r>
       <w:r>
-        <w:t xml:space="preserve">This will primarily be on the last part of the course, since there is no work to turn in from that part. It will be a mix of short-answer and multiple-choice.</w:t>
+        <w:t xml:space="preserve">This will be on the last part of the course, since there is no work to turn in from that part. It will be a mix of short-answer and multiple-choice.</w:t>
       </w:r>
     </w:p>
     <w:bookmarkEnd w:id="16"/>
@@ -919,7 +919,7 @@
         <w:t xml:space="preserve"> </w:t>
       </w:r>
       <w:r>
-        <w:t xml:space="preserve">section where you record all the help you got, from friends, family, books, computers, etc. You should overshare here; it’s fine to get lots of help, and as long as the result is your own work, we aren’t going to worry what help you got. One exception to this: if if you do use any online tools (that includes search engines, now that they have language models built it) you must keep records of everything you ask them. Do not use anyone else’s account, or any account you cannot access the history of, for any course-related purpose.</w:t>
+        <w:t xml:space="preserve">section where you record all the help you got, from friends, family, books, computers, etc. You should overshare here; it’s fine to get lots of help, and as long as the result is your own work, we aren’t going to worry what help you got. One exception to this: if if you do use any online tools (that includes search engines, now that they have language models built in) you must keep records of everything you ask them. Do not use anyone else’s account, or any account you cannot access the history of, for any course-related purpose.</w:t>
       </w:r>
     </w:p>
     <w:p>
@@ -1075,7 +1075,7 @@
       </w:r>
     </w:p>
     <w:bookmarkEnd w:id="19"/>
-    <w:bookmarkStart w:id="119" w:name="class-schedule"/>
+    <w:bookmarkStart w:id="120" w:name="class-schedule"/>
     <w:p>
       <w:pPr>
         <w:pStyle w:val="Heading1"/>
@@ -1277,11 +1277,9 @@
       <w:r>
         <w:t xml:space="preserve">This isn’t a philosophy paper, but we’ll start with the philosophical presuppositions behind it.</w:t>
       </w:r>
-    </w:p>
-    <w:p>
-      <w:pPr>
-        <w:pStyle w:val="BodyText"/>
-      </w:pPr>
+      <w:r>
+        <w:br/>
+      </w:r>
       <w:r>
         <w:rPr>
           <w:b/>
@@ -1377,11 +1375,9 @@
       <w:r>
         <w:t xml:space="preserve">.</w:t>
       </w:r>
-    </w:p>
-    <w:p>
-      <w:pPr>
-        <w:pStyle w:val="BodyText"/>
-      </w:pPr>
+      <w:r>
+        <w:br/>
+      </w:r>
       <w:r>
         <w:rPr>
           <w:b/>
@@ -1455,11 +1451,9 @@
       <w:r>
         <w:t xml:space="preserve">(1000-Word Philosophy).</w:t>
       </w:r>
-    </w:p>
-    <w:p>
-      <w:pPr>
-        <w:pStyle w:val="BodyText"/>
-      </w:pPr>
+      <w:r>
+        <w:br/>
+      </w:r>
       <w:r>
         <w:rPr>
           <w:b/>
@@ -1468,7 +1462,7 @@
         <w:t xml:space="preserve">Required</w:t>
       </w:r>
       <w:r>
-        <w:t xml:space="preserve">: SEP,</w:t>
+        <w:t xml:space="preserve">: Stephen Phillips and Anand Vaidya SEP,</w:t>
       </w:r>
       <w:r>
         <w:t xml:space="preserve"> </w:t>
@@ -1478,29 +1472,28 @@
           <w:rPr>
             <w:rStyle w:val="Hyperlink"/>
           </w:rPr>
-          <w:t xml:space="preserve">“Epistemology in Classical Indian Philosophy,”</w:t>
-        </w:r>
-        <w:r>
-          <w:rPr>
-            <w:rStyle w:val="Hyperlink"/>
-          </w:rPr>
-          <w:t xml:space="preserve"> </w:t>
-        </w:r>
-        <w:r>
-          <w:rPr>
-            <w:rStyle w:val="Hyperlink"/>
-          </w:rPr>
-          <w:t xml:space="preserve">§1.1</w:t>
-        </w:r>
-      </w:hyperlink>
+          <w:t xml:space="preserve">“Epistemology in Classical Indian Philosophy”</w:t>
+        </w:r>
+      </w:hyperlink>
+      <w:r>
+        <w:t xml:space="preserve">, SEP,</w:t>
+      </w:r>
+      <w:r>
+        <w:t xml:space="preserve"> </w:t>
+      </w:r>
+      <w:r>
+        <w:rPr>
+          <w:b/>
+          <w:bCs/>
+        </w:rPr>
+        <w:t xml:space="preserve">§1.1</w:t>
+      </w:r>
       <w:r>
         <w:t xml:space="preserve">.</w:t>
       </w:r>
-    </w:p>
-    <w:p>
-      <w:pPr>
-        <w:pStyle w:val="BodyText"/>
-      </w:pPr>
+      <w:r>
+        <w:br/>
+      </w:r>
       <w:r>
         <w:rPr>
           <w:b/>
@@ -1509,7 +1502,7 @@
         <w:t xml:space="preserve">Recommended</w:t>
       </w:r>
       <w:r>
-        <w:t xml:space="preserve">: IEP,</w:t>
+        <w:t xml:space="preserve">: Ted Poston,</w:t>
       </w:r>
       <w:r>
         <w:t xml:space="preserve"> </w:t>
@@ -1519,21 +1512,22 @@
           <w:rPr>
             <w:rStyle w:val="Hyperlink"/>
           </w:rPr>
-          <w:t xml:space="preserve">“Foundationalism,”</w:t>
-        </w:r>
-        <w:r>
-          <w:rPr>
-            <w:rStyle w:val="Hyperlink"/>
-          </w:rPr>
-          <w:t xml:space="preserve"> </w:t>
-        </w:r>
-        <w:r>
-          <w:rPr>
-            <w:rStyle w:val="Hyperlink"/>
-          </w:rPr>
-          <w:t xml:space="preserve">§§1–2</w:t>
-        </w:r>
-      </w:hyperlink>
+          <w:t xml:space="preserve">“Foundationalism”</w:t>
+        </w:r>
+      </w:hyperlink>
+      <w:r>
+        <w:t xml:space="preserve">, IEP,</w:t>
+      </w:r>
+      <w:r>
+        <w:t xml:space="preserve"> </w:t>
+      </w:r>
+      <w:r>
+        <w:rPr>
+          <w:b/>
+          <w:bCs/>
+        </w:rPr>
+        <w:t xml:space="preserve">§§1–2</w:t>
+      </w:r>
       <w:r>
         <w:t xml:space="preserve">.</w:t>
       </w:r>
@@ -1560,7 +1554,7 @@
         <w:t xml:space="preserve">Required</w:t>
       </w:r>
       <w:r>
-        <w:t xml:space="preserve">: SEP,</w:t>
+        <w:t xml:space="preserve">: Matthew Frise,</w:t>
       </w:r>
       <w:r>
         <w:t xml:space="preserve"> </w:t>
@@ -1570,29 +1564,28 @@
           <w:rPr>
             <w:rStyle w:val="Hyperlink"/>
           </w:rPr>
-          <w:t xml:space="preserve">“Epistemological Problems of Memory,”</w:t>
-        </w:r>
-        <w:r>
-          <w:rPr>
-            <w:rStyle w:val="Hyperlink"/>
-          </w:rPr>
-          <w:t xml:space="preserve"> </w:t>
-        </w:r>
-        <w:r>
-          <w:rPr>
-            <w:rStyle w:val="Hyperlink"/>
-          </w:rPr>
-          <w:t xml:space="preserve">§2.4</w:t>
-        </w:r>
-      </w:hyperlink>
+          <w:t xml:space="preserve">“Epistemological Problems of Memory”</w:t>
+        </w:r>
+      </w:hyperlink>
+      <w:r>
+        <w:t xml:space="preserve">, SEP,</w:t>
+      </w:r>
+      <w:r>
+        <w:t xml:space="preserve"> </w:t>
+      </w:r>
+      <w:r>
+        <w:rPr>
+          <w:b/>
+          <w:bCs/>
+        </w:rPr>
+        <w:t xml:space="preserve">§2.4</w:t>
+      </w:r>
       <w:r>
         <w:t xml:space="preserve">.</w:t>
       </w:r>
-    </w:p>
-    <w:p>
-      <w:pPr>
-        <w:pStyle w:val="BodyText"/>
-      </w:pPr>
+      <w:r>
+        <w:br/>
+      </w:r>
       <w:r>
         <w:rPr>
           <w:b/>
@@ -1659,6 +1652,98 @@
           </w:rPr>
           <w:t xml:space="preserve">“Testimony as a Method of Knowledge,”</w:t>
         </w:r>
+      </w:hyperlink>
+      <w:r>
+        <w:t xml:space="preserve"> </w:t>
+      </w:r>
+      <w:r>
+        <w:rPr>
+          <w:i/>
+          <w:iCs/>
+        </w:rPr>
+        <w:t xml:space="preserve">Mind</w:t>
+      </w:r>
+      <w:r>
+        <w:t xml:space="preserve"> </w:t>
+      </w:r>
+      <w:r>
+        <w:t xml:space="preserve">36 (1927): 354–358. (Note you need to be on campus, or have a JSTOR account, for this one.)</w:t>
+      </w:r>
+      <w:r>
+        <w:br/>
+      </w:r>
+      <w:r>
+        <w:rPr>
+          <w:b/>
+          <w:bCs/>
+        </w:rPr>
+        <w:t xml:space="preserve">Recommended</w:t>
+      </w:r>
+      <w:r>
+        <w:t xml:space="preserve">: Dan Sperber et al.,</w:t>
+      </w:r>
+      <w:r>
+        <w:t xml:space="preserve"> </w:t>
+      </w:r>
+      <w:hyperlink r:id="rId38">
+        <w:r>
+          <w:rPr>
+            <w:rStyle w:val="Hyperlink"/>
+          </w:rPr>
+          <w:t xml:space="preserve">“Epistemic Vigilance,”</w:t>
+        </w:r>
+      </w:hyperlink>
+      <w:r>
+        <w:t xml:space="preserve"> </w:t>
+      </w:r>
+      <w:r>
+        <w:rPr>
+          <w:i/>
+          <w:iCs/>
+        </w:rPr>
+        <w:t xml:space="preserve">Mind &amp; Language</w:t>
+      </w:r>
+      <w:r>
+        <w:t xml:space="preserve"> </w:t>
+      </w:r>
+      <w:r>
+        <w:t xml:space="preserve">25 (2010).</w:t>
+      </w:r>
+    </w:p>
+    <w:bookmarkEnd w:id="39"/>
+    <w:bookmarkStart w:id="42" w:name="X948a7c28f03938602191d6e41c47b6a9fd84c4c"/>
+    <w:p>
+      <w:pPr>
+        <w:pStyle w:val="Heading3"/>
+      </w:pPr>
+      <w:r>
+        <w:t xml:space="preserve">Thursday, September 24 (Lecture 8) — Whom do you trust?</w:t>
+      </w:r>
+    </w:p>
+    <w:p>
+      <w:pPr>
+        <w:pStyle w:val="FirstParagraph"/>
+      </w:pPr>
+      <w:r>
+        <w:rPr>
+          <w:b/>
+          <w:bCs/>
+        </w:rPr>
+        <w:t xml:space="preserve">Required</w:t>
+      </w:r>
+      <w:r>
+        <w:t xml:space="preserve">: Elizabeth Anderson,</w:t>
+      </w:r>
+      <w:r>
+        <w:t xml:space="preserve"> </w:t>
+      </w:r>
+      <w:hyperlink r:id="rId40">
+        <w:r>
+          <w:rPr>
+            <w:rStyle w:val="Hyperlink"/>
+          </w:rPr>
+          <w:t xml:space="preserve">“Democracy, Public Policy, and Lay Assessments of Scientific Testimony,”</w:t>
+        </w:r>
         <w:r>
           <w:rPr>
             <w:rStyle w:val="Hyperlink"/>
@@ -1671,7 +1756,7 @@
             <w:i/>
             <w:iCs/>
           </w:rPr>
-          <w:t xml:space="preserve">Mind</w:t>
+          <w:t xml:space="preserve">Episteme</w:t>
         </w:r>
         <w:r>
           <w:rPr>
@@ -1683,17 +1768,15 @@
           <w:rPr>
             <w:rStyle w:val="Hyperlink"/>
           </w:rPr>
-          <w:t xml:space="preserve">36 (1927): 354–358</w:t>
+          <w:t xml:space="preserve">(2011), §2 (pp. 145–149)</w:t>
         </w:r>
       </w:hyperlink>
       <w:r>
         <w:t xml:space="preserve">.</w:t>
       </w:r>
-    </w:p>
-    <w:p>
-      <w:pPr>
-        <w:pStyle w:val="BodyText"/>
-      </w:pPr>
+      <w:r>
+        <w:br/>
+      </w:r>
       <w:r>
         <w:rPr>
           <w:b/>
@@ -1702,127 +1785,7 @@
         <w:t xml:space="preserve">Recommended</w:t>
       </w:r>
       <w:r>
-        <w:t xml:space="preserve">: Dan Sperber et al.,</w:t>
-      </w:r>
-      <w:r>
-        <w:t xml:space="preserve"> </w:t>
-      </w:r>
-      <w:hyperlink r:id="rId38">
-        <w:r>
-          <w:rPr>
-            <w:rStyle w:val="Hyperlink"/>
-          </w:rPr>
-          <w:t xml:space="preserve">“Epistemic Vigilance,”</w:t>
-        </w:r>
-        <w:r>
-          <w:rPr>
-            <w:rStyle w:val="Hyperlink"/>
-          </w:rPr>
-          <w:t xml:space="preserve"> </w:t>
-        </w:r>
-        <w:r>
-          <w:rPr>
-            <w:rStyle w:val="Hyperlink"/>
-            <w:i/>
-            <w:iCs/>
-          </w:rPr>
-          <w:t xml:space="preserve">Mind &amp; Language</w:t>
-        </w:r>
-        <w:r>
-          <w:rPr>
-            <w:rStyle w:val="Hyperlink"/>
-          </w:rPr>
-          <w:t xml:space="preserve"> </w:t>
-        </w:r>
-        <w:r>
-          <w:rPr>
-            <w:rStyle w:val="Hyperlink"/>
-          </w:rPr>
-          <w:t xml:space="preserve">25 (2010)</w:t>
-        </w:r>
-      </w:hyperlink>
-      <w:r>
-        <w:t xml:space="preserve">.</w:t>
-      </w:r>
-    </w:p>
-    <w:bookmarkEnd w:id="39"/>
-    <w:bookmarkStart w:id="42" w:name="X948a7c28f03938602191d6e41c47b6a9fd84c4c"/>
-    <w:p>
-      <w:pPr>
-        <w:pStyle w:val="Heading3"/>
-      </w:pPr>
-      <w:r>
-        <w:t xml:space="preserve">Thursday, September 24 (Lecture 8) — Whom do you trust?</w:t>
-      </w:r>
-    </w:p>
-    <w:p>
-      <w:pPr>
-        <w:pStyle w:val="FirstParagraph"/>
-      </w:pPr>
-      <w:r>
-        <w:rPr>
-          <w:b/>
-          <w:bCs/>
-        </w:rPr>
-        <w:t xml:space="preserve">Required</w:t>
-      </w:r>
-      <w:r>
-        <w:t xml:space="preserve">: Elizabeth Anderson,</w:t>
-      </w:r>
-      <w:r>
-        <w:t xml:space="preserve"> </w:t>
-      </w:r>
-      <w:hyperlink r:id="rId40">
-        <w:r>
-          <w:rPr>
-            <w:rStyle w:val="Hyperlink"/>
-          </w:rPr>
-          <w:t xml:space="preserve">“Democracy, Public Policy, and Lay Assessments of Scientific Testimony,”</w:t>
-        </w:r>
-        <w:r>
-          <w:rPr>
-            <w:rStyle w:val="Hyperlink"/>
-          </w:rPr>
-          <w:t xml:space="preserve"> </w:t>
-        </w:r>
-        <w:r>
-          <w:rPr>
-            <w:rStyle w:val="Hyperlink"/>
-            <w:i/>
-            <w:iCs/>
-          </w:rPr>
-          <w:t xml:space="preserve">Episteme</w:t>
-        </w:r>
-        <w:r>
-          <w:rPr>
-            <w:rStyle w:val="Hyperlink"/>
-          </w:rPr>
-          <w:t xml:space="preserve"> </w:t>
-        </w:r>
-        <w:r>
-          <w:rPr>
-            <w:rStyle w:val="Hyperlink"/>
-          </w:rPr>
-          <w:t xml:space="preserve">(2011), §2 (pp. 145–149)</w:t>
-        </w:r>
-      </w:hyperlink>
-      <w:r>
-        <w:t xml:space="preserve">.</w:t>
-      </w:r>
-    </w:p>
-    <w:p>
-      <w:pPr>
-        <w:pStyle w:val="BodyText"/>
-      </w:pPr>
-      <w:r>
-        <w:rPr>
-          <w:b/>
-          <w:bCs/>
-        </w:rPr>
-        <w:t xml:space="preserve">Recommended</w:t>
-      </w:r>
-      <w:r>
-        <w:t xml:space="preserve">: SEP,</w:t>
+        <w:t xml:space="preserve">: Helen Longino,</w:t>
       </w:r>
       <w:r>
         <w:t xml:space="preserve"> </w:t>
@@ -1832,21 +1795,22 @@
           <w:rPr>
             <w:rStyle w:val="Hyperlink"/>
           </w:rPr>
-          <w:t xml:space="preserve">“The Social Dimensions of Scientific Knowledge,”</w:t>
-        </w:r>
-        <w:r>
-          <w:rPr>
-            <w:rStyle w:val="Hyperlink"/>
-          </w:rPr>
-          <w:t xml:space="preserve"> </w:t>
-        </w:r>
-        <w:r>
-          <w:rPr>
-            <w:rStyle w:val="Hyperlink"/>
-          </w:rPr>
-          <w:t xml:space="preserve">§2</w:t>
-        </w:r>
-      </w:hyperlink>
+          <w:t xml:space="preserve">“The Social Dimensions of Scientific Knowledge”</w:t>
+        </w:r>
+      </w:hyperlink>
+      <w:r>
+        <w:t xml:space="preserve">, SEP,</w:t>
+      </w:r>
+      <w:r>
+        <w:t xml:space="preserve"> </w:t>
+      </w:r>
+      <w:r>
+        <w:rPr>
+          <w:b/>
+          <w:bCs/>
+        </w:rPr>
+        <w:t xml:space="preserve">§2</w:t>
+      </w:r>
       <w:r>
         <w:t xml:space="preserve">.</w:t>
       </w:r>
@@ -1895,41 +1859,202 @@
           </w:rPr>
           <w:t xml:space="preserve">“Escape the Echo Chamber”</w:t>
         </w:r>
-        <w:r>
-          <w:rPr>
-            <w:rStyle w:val="Hyperlink"/>
-          </w:rPr>
-          <w:t xml:space="preserve"> </w:t>
-        </w:r>
-        <w:r>
-          <w:rPr>
-            <w:rStyle w:val="Hyperlink"/>
-          </w:rPr>
-          <w:t xml:space="preserve">(</w:t>
-        </w:r>
+      </w:hyperlink>
+      <w:r>
+        <w:t xml:space="preserve">,</w:t>
+      </w:r>
+      <w:r>
+        <w:t xml:space="preserve"> </w:t>
+      </w:r>
+      <w:r>
+        <w:rPr>
+          <w:i/>
+          <w:iCs/>
+        </w:rPr>
+        <w:t xml:space="preserve">Aeon</w:t>
+      </w:r>
+      <w:r>
+        <w:t xml:space="preserve">.</w:t>
+      </w:r>
+      <w:r>
+        <w:br/>
+      </w:r>
+      <w:r>
+        <w:rPr>
+          <w:b/>
+          <w:bCs/>
+        </w:rPr>
+        <w:t xml:space="preserve">Required</w:t>
+      </w:r>
+      <w:r>
+        <w:t xml:space="preserve">: Naomi Oreskes,</w:t>
+      </w:r>
+      <w:r>
+        <w:t xml:space="preserve"> </w:t>
+      </w:r>
+      <w:hyperlink r:id="rId45">
+        <w:r>
+          <w:rPr>
+            <w:rStyle w:val="Hyperlink"/>
+          </w:rPr>
+          <w:t xml:space="preserve">“Defending science in a post-fact era”</w:t>
+        </w:r>
+      </w:hyperlink>
+      <w:r>
+        <w:t xml:space="preserve">,</w:t>
+      </w:r>
+      <w:r>
+        <w:t xml:space="preserve"> </w:t>
+      </w:r>
+      <w:r>
+        <w:rPr>
+          <w:i/>
+          <w:iCs/>
+        </w:rPr>
+        <w:t xml:space="preserve">Harvard Gazette</w:t>
+      </w:r>
+      <w:r>
+        <w:t xml:space="preserve">, 2019. (The important part is the third question, about the</w:t>
+      </w:r>
+      <w:r>
+        <w:t xml:space="preserve"> </w:t>
+      </w:r>
+      <w:r>
+        <w:t xml:space="preserve">‘five pillars’</w:t>
+      </w:r>
+      <w:r>
+        <w:t xml:space="preserve">. The rest of the interview is</w:t>
+      </w:r>
+      <w:r>
+        <w:t xml:space="preserve"> </w:t>
+      </w:r>
+      <w:r>
+        <w:rPr>
+          <w:b/>
+          <w:bCs/>
+        </w:rPr>
+        <w:t xml:space="preserve">Recommended</w:t>
+      </w:r>
+      <w:r>
+        <w:t xml:space="preserve">.)</w:t>
+      </w:r>
+    </w:p>
+    <w:p>
+      <w:pPr>
+        <w:pStyle w:val="BodyText"/>
+      </w:pPr>
+      <w:r>
+        <w:rPr>
+          <w:i/>
+          <w:iCs/>
+        </w:rPr>
+        <w:t xml:space="preserve">Module Quiz 1 (Lectures 1–9) opens after class, due Sunday.</w:t>
+      </w:r>
+      <w:r>
+        <w:t xml:space="preserve"> </w:t>
+      </w:r>
+      <w:r>
+        <w:t xml:space="preserve">(NOTE FOR GSIs; should I just post the questions earlier?)</w:t>
+      </w:r>
+    </w:p>
+    <w:bookmarkEnd w:id="46"/>
+    <w:bookmarkStart w:id="50" w:name="X0b9314308d9385921b437b2ed817f2353b12170"/>
+    <w:p>
+      <w:pPr>
+        <w:pStyle w:val="Heading3"/>
+      </w:pPr>
+      <w:r>
+        <w:t xml:space="preserve">Thursday, October 01 (Lecture 10) — Perception reconsidered</w:t>
+      </w:r>
+    </w:p>
+    <w:p>
+      <w:pPr>
+        <w:pStyle w:val="FirstParagraph"/>
+      </w:pPr>
+      <w:r>
+        <w:rPr>
+          <w:b/>
+          <w:bCs/>
+        </w:rPr>
+        <w:t xml:space="preserve">Required</w:t>
+      </w:r>
+      <w:r>
+        <w:t xml:space="preserve">: Bertrand Russell,</w:t>
+      </w:r>
+      <w:r>
+        <w:t xml:space="preserve"> </w:t>
+      </w:r>
+      <w:hyperlink r:id="rId47">
         <w:r>
           <w:rPr>
             <w:rStyle w:val="Hyperlink"/>
             <w:i/>
             <w:iCs/>
           </w:rPr>
-          <w:t xml:space="preserve">Aeon</w:t>
-        </w:r>
-        <w:r>
-          <w:rPr>
-            <w:rStyle w:val="Hyperlink"/>
-          </w:rPr>
-          <w:t xml:space="preserve">)</w:t>
-        </w:r>
-      </w:hyperlink>
+          <w:t xml:space="preserve">The Problems of Philosophy</w:t>
+        </w:r>
+      </w:hyperlink>
+      <w:r>
+        <w:t xml:space="preserve">, ch. 1,</w:t>
+      </w:r>
+      <w:r>
+        <w:t xml:space="preserve"> </w:t>
+      </w:r>
+      <w:r>
+        <w:t xml:space="preserve">“Appearance and Reality.”</w:t>
+      </w:r>
+      <w:r>
+        <w:br/>
+      </w:r>
+      <w:r>
+        <w:rPr>
+          <w:b/>
+          <w:bCs/>
+        </w:rPr>
+        <w:t xml:space="preserve">Recommended</w:t>
+      </w:r>
+      <w:r>
+        <w:t xml:space="preserve">: Tim Crane and Craig French,</w:t>
+      </w:r>
+      <w:r>
+        <w:t xml:space="preserve"> </w:t>
+      </w:r>
+      <w:hyperlink r:id="rId48">
+        <w:r>
+          <w:rPr>
+            <w:rStyle w:val="Hyperlink"/>
+          </w:rPr>
+          <w:t xml:space="preserve">“The Problem of Perception”</w:t>
+        </w:r>
+      </w:hyperlink>
+      <w:r>
+        <w:t xml:space="preserve">, SEP,</w:t>
+      </w:r>
+      <w:r>
+        <w:t xml:space="preserve"> </w:t>
+      </w:r>
+      <w:r>
+        <w:t xml:space="preserve">“The Argument from Illusion”</w:t>
+      </w:r>
+      <w:r>
+        <w:t xml:space="preserve">,</w:t>
+      </w:r>
+      <w:r>
+        <w:t xml:space="preserve"> </w:t>
+      </w:r>
+      <w:r>
+        <w:rPr>
+          <w:b/>
+          <w:bCs/>
+        </w:rPr>
+        <w:t xml:space="preserve">§2</w:t>
+      </w:r>
       <w:r>
         <w:t xml:space="preserve">.</w:t>
       </w:r>
-    </w:p>
-    <w:p>
-      <w:pPr>
-        <w:pStyle w:val="BodyText"/>
-      </w:pPr>
+      <w:r>
+        <w:br/>
+      </w:r>
       <w:r>
         <w:rPr>
           <w:b/>
@@ -1938,174 +2063,7 @@
         <w:t xml:space="preserve">Recommended</w:t>
       </w:r>
       <w:r>
-        <w:t xml:space="preserve">: Naomi Oreskes,</w:t>
-      </w:r>
-      <w:r>
-        <w:t xml:space="preserve"> </w:t>
-      </w:r>
-      <w:hyperlink r:id="rId45">
-        <w:r>
-          <w:rPr>
-            <w:rStyle w:val="Hyperlink"/>
-          </w:rPr>
-          <w:t xml:space="preserve">“Defending science in a post-fact era”</w:t>
-        </w:r>
-        <w:r>
-          <w:rPr>
-            <w:rStyle w:val="Hyperlink"/>
-          </w:rPr>
-          <w:t xml:space="preserve"> </w:t>
-        </w:r>
-        <w:r>
-          <w:rPr>
-            <w:rStyle w:val="Hyperlink"/>
-          </w:rPr>
-          <w:t xml:space="preserve">(</w:t>
-        </w:r>
-        <w:r>
-          <w:rPr>
-            <w:rStyle w:val="Hyperlink"/>
-            <w:i/>
-            <w:iCs/>
-          </w:rPr>
-          <w:t xml:space="preserve">Harvard Gazette</w:t>
-        </w:r>
-        <w:r>
-          <w:rPr>
-            <w:rStyle w:val="Hyperlink"/>
-          </w:rPr>
-          <w:t xml:space="preserve">, 2019)</w:t>
-        </w:r>
-      </w:hyperlink>
-      <w:r>
-        <w:t xml:space="preserve">.</w:t>
-      </w:r>
-    </w:p>
-    <w:p>
-      <w:pPr>
-        <w:pStyle w:val="BodyText"/>
-      </w:pPr>
-      <w:r>
-        <w:rPr>
-          <w:i/>
-          <w:iCs/>
-        </w:rPr>
-        <w:t xml:space="preserve">Module Quiz 1 (Lectures 1–9) opens after class, due Sunday.</w:t>
-      </w:r>
-      <w:r>
-        <w:t xml:space="preserve"> </w:t>
-      </w:r>
-      <w:r>
-        <w:t xml:space="preserve">(NOTE FOR GSIs; should I just post the questions earlier?)</w:t>
-      </w:r>
-    </w:p>
-    <w:bookmarkEnd w:id="46"/>
-    <w:bookmarkStart w:id="50" w:name="X0b9314308d9385921b437b2ed817f2353b12170"/>
-    <w:p>
-      <w:pPr>
-        <w:pStyle w:val="Heading3"/>
-      </w:pPr>
-      <w:r>
-        <w:t xml:space="preserve">Thursday, October 01 (Lecture 10) — Perception reconsidered</w:t>
-      </w:r>
-    </w:p>
-    <w:p>
-      <w:pPr>
-        <w:pStyle w:val="FirstParagraph"/>
-      </w:pPr>
-      <w:r>
-        <w:rPr>
-          <w:b/>
-          <w:bCs/>
-        </w:rPr>
-        <w:t xml:space="preserve">Required</w:t>
-      </w:r>
-      <w:r>
-        <w:t xml:space="preserve">: Bertrand Russell,</w:t>
-      </w:r>
-      <w:r>
-        <w:t xml:space="preserve"> </w:t>
-      </w:r>
-      <w:hyperlink r:id="rId47">
-        <w:r>
-          <w:rPr>
-            <w:rStyle w:val="Hyperlink"/>
-            <w:i/>
-            <w:iCs/>
-          </w:rPr>
-          <w:t xml:space="preserve">The Problems of Philosophy</w:t>
-        </w:r>
-        <w:r>
-          <w:rPr>
-            <w:rStyle w:val="Hyperlink"/>
-          </w:rPr>
-          <w:t xml:space="preserve">, ch. 1,</w:t>
-        </w:r>
-        <w:r>
-          <w:rPr>
-            <w:rStyle w:val="Hyperlink"/>
-          </w:rPr>
-          <w:t xml:space="preserve"> </w:t>
-        </w:r>
-        <w:r>
-          <w:rPr>
-            <w:rStyle w:val="Hyperlink"/>
-          </w:rPr>
-          <w:t xml:space="preserve">“Appearance and Reality.”</w:t>
-        </w:r>
-      </w:hyperlink>
-    </w:p>
-    <w:p>
-      <w:pPr>
-        <w:pStyle w:val="BodyText"/>
-      </w:pPr>
-      <w:r>
-        <w:rPr>
-          <w:b/>
-          <w:bCs/>
-        </w:rPr>
-        <w:t xml:space="preserve">Recommended</w:t>
-      </w:r>
-      <w:r>
-        <w:t xml:space="preserve">: SEP,</w:t>
-      </w:r>
-      <w:r>
-        <w:t xml:space="preserve"> </w:t>
-      </w:r>
-      <w:hyperlink r:id="rId48">
-        <w:r>
-          <w:rPr>
-            <w:rStyle w:val="Hyperlink"/>
-          </w:rPr>
-          <w:t xml:space="preserve">“The Problem of Perception,”</w:t>
-        </w:r>
-        <w:r>
-          <w:rPr>
-            <w:rStyle w:val="Hyperlink"/>
-          </w:rPr>
-          <w:t xml:space="preserve"> </w:t>
-        </w:r>
-        <w:r>
-          <w:rPr>
-            <w:rStyle w:val="Hyperlink"/>
-          </w:rPr>
-          <w:t xml:space="preserve">§2,</w:t>
-        </w:r>
-        <w:r>
-          <w:rPr>
-            <w:rStyle w:val="Hyperlink"/>
-          </w:rPr>
-          <w:t xml:space="preserve"> </w:t>
-        </w:r>
-        <w:r>
-          <w:rPr>
-            <w:rStyle w:val="Hyperlink"/>
-          </w:rPr>
-          <w:t xml:space="preserve">“The Argument from Illusion”</w:t>
-        </w:r>
-      </w:hyperlink>
-      <w:r>
-        <w:t xml:space="preserve">; and IEP,</w:t>
+        <w:t xml:space="preserve">: Paul Coates,</w:t>
       </w:r>
       <w:r>
         <w:t xml:space="preserve"> </w:t>
@@ -2119,7 +2077,7 @@
         </w:r>
       </w:hyperlink>
       <w:r>
-        <w:t xml:space="preserve">.</w:t>
+        <w:t xml:space="preserve">, IEP.</w:t>
       </w:r>
     </w:p>
     <w:bookmarkEnd w:id="50"/>
@@ -2224,11 +2182,9 @@
       <w:r>
         <w:t xml:space="preserve">(1000-Word Philosophy).</w:t>
       </w:r>
-    </w:p>
-    <w:p>
-      <w:pPr>
-        <w:pStyle w:val="BodyText"/>
-      </w:pPr>
+      <w:r>
+        <w:br/>
+      </w:r>
       <w:r>
         <w:rPr>
           <w:b/>
@@ -2277,13 +2233,13 @@
         <w:t xml:space="preserve">Week 7: Dualism</w:t>
       </w:r>
     </w:p>
-    <w:bookmarkStart w:id="62" w:name="X9208c86b40eb7ee6017f28291a7f3f9ef1baf11"/>
+    <w:bookmarkStart w:id="62" w:name="X28f07e07b0ed06b9de4ffbf5e0d4c03242e17c1"/>
     <w:p>
       <w:pPr>
         <w:pStyle w:val="Heading3"/>
       </w:pPr>
       <w:r>
-        <w:t xml:space="preserve">Tuesday, October 13 (Lecture 13) — The case for</w:t>
+        <w:t xml:space="preserve">Tuesday, October 13 (Lecture 13) — The case for Dualism</w:t>
       </w:r>
     </w:p>
     <w:p>
@@ -2340,11 +2296,9 @@
       <w:r>
         <w:t xml:space="preserve">.</w:t>
       </w:r>
-    </w:p>
-    <w:p>
-      <w:pPr>
-        <w:pStyle w:val="BodyText"/>
-      </w:pPr>
+      <w:r>
+        <w:br/>
+      </w:r>
       <w:r>
         <w:rPr>
           <w:b/>
@@ -2398,11 +2352,9 @@
       <w:r>
         <w:t xml:space="preserve">(1000-Word Philosophy). The most important part is the end, on Meditation VI.</w:t>
       </w:r>
-    </w:p>
-    <w:p>
-      <w:pPr>
-        <w:pStyle w:val="BodyText"/>
-      </w:pPr>
+      <w:r>
+        <w:br/>
+      </w:r>
       <w:r>
         <w:rPr>
           <w:b/>
@@ -2461,7 +2413,20 @@
         </w:r>
       </w:hyperlink>
       <w:r>
-        <w:t xml:space="preserve">; and</w:t>
+        <w:t xml:space="preserve">.</w:t>
+      </w:r>
+      <w:r>
+        <w:br/>
+      </w:r>
+      <w:r>
+        <w:rPr>
+          <w:b/>
+          <w:bCs/>
+        </w:rPr>
+        <w:t xml:space="preserve">Recommended</w:t>
+      </w:r>
+      <w:r>
+        <w:t xml:space="preserve">: René Descartes</w:t>
       </w:r>
       <w:r>
         <w:t xml:space="preserve"> </w:t>
@@ -2471,68 +2436,66 @@
           <w:rPr>
             <w:rStyle w:val="Hyperlink"/>
           </w:rPr>
-          <w:t xml:space="preserve">Descartes, Meditation VI itself (Bennett, Early Modern Texts)</w:t>
+          <w:t xml:space="preserve">Meditation VI</w:t>
+        </w:r>
+      </w:hyperlink>
+      <w:r>
+        <w:t xml:space="preserve">, translated by Jonathan Bennett.</w:t>
+      </w:r>
+    </w:p>
+    <w:bookmarkEnd w:id="62"/>
+    <w:bookmarkStart w:id="65" w:name="X0071eb8764b9615fa532bae8d3896a626f200f7"/>
+    <w:p>
+      <w:pPr>
+        <w:pStyle w:val="Heading3"/>
+      </w:pPr>
+      <w:r>
+        <w:t xml:space="preserve">Thursday, October 15 (Lecture 14) — The case against Dualism</w:t>
+      </w:r>
+    </w:p>
+    <w:p>
+      <w:pPr>
+        <w:pStyle w:val="FirstParagraph"/>
+      </w:pPr>
+      <w:r>
+        <w:rPr>
+          <w:b/>
+          <w:bCs/>
+        </w:rPr>
+        <w:t xml:space="preserve">Required</w:t>
+      </w:r>
+      <w:r>
+        <w:t xml:space="preserve">: Jacob Berger,</w:t>
+      </w:r>
+      <w:r>
+        <w:t xml:space="preserve"> </w:t>
+      </w:r>
+      <w:hyperlink r:id="rId60">
+        <w:r>
+          <w:rPr>
+            <w:rStyle w:val="Hyperlink"/>
+          </w:rPr>
+          <w:t xml:space="preserve">“The Mind-Body Problem: What Are Minds?”</w:t>
+        </w:r>
+        <w:r>
+          <w:rPr>
+            <w:rStyle w:val="Hyperlink"/>
+          </w:rPr>
+          <w:t xml:space="preserve"> </w:t>
+        </w:r>
+        <w:r>
+          <w:rPr>
+            <w:rStyle w:val="Hyperlink"/>
+          </w:rPr>
+          <w:t xml:space="preserve">(1000-Word Philosophy)</w:t>
         </w:r>
       </w:hyperlink>
       <w:r>
         <w:t xml:space="preserve">.</w:t>
       </w:r>
-    </w:p>
-    <w:bookmarkEnd w:id="62"/>
-    <w:bookmarkStart w:id="65" w:name="X7ab1e3f1b7883094be79b105e38268afa54e2cd"/>
-    <w:p>
-      <w:pPr>
-        <w:pStyle w:val="Heading3"/>
-      </w:pPr>
-      <w:r>
-        <w:t xml:space="preserve">Thursday, October 15 (Lecture 14) — The case against</w:t>
-      </w:r>
-    </w:p>
-    <w:p>
-      <w:pPr>
-        <w:pStyle w:val="FirstParagraph"/>
-      </w:pPr>
-      <w:r>
-        <w:rPr>
-          <w:b/>
-          <w:bCs/>
-        </w:rPr>
-        <w:t xml:space="preserve">Required</w:t>
-      </w:r>
-      <w:r>
-        <w:t xml:space="preserve">: Jacob Berger,</w:t>
-      </w:r>
-      <w:r>
-        <w:t xml:space="preserve"> </w:t>
-      </w:r>
-      <w:hyperlink r:id="rId60">
-        <w:r>
-          <w:rPr>
-            <w:rStyle w:val="Hyperlink"/>
-          </w:rPr>
-          <w:t xml:space="preserve">“The Mind-Body Problem: What Are Minds?”</w:t>
-        </w:r>
-        <w:r>
-          <w:rPr>
-            <w:rStyle w:val="Hyperlink"/>
-          </w:rPr>
-          <w:t xml:space="preserve"> </w:t>
-        </w:r>
-        <w:r>
-          <w:rPr>
-            <w:rStyle w:val="Hyperlink"/>
-          </w:rPr>
-          <w:t xml:space="preserve">(1000-Word Philosophy)</w:t>
-        </w:r>
-      </w:hyperlink>
-      <w:r>
-        <w:t xml:space="preserve">.</w:t>
-      </w:r>
-    </w:p>
-    <w:p>
-      <w:pPr>
-        <w:pStyle w:val="BodyText"/>
-      </w:pPr>
+      <w:r>
+        <w:br/>
+      </w:r>
       <w:r>
         <w:rPr>
           <w:b/>
@@ -2541,7 +2504,7 @@
         <w:t xml:space="preserve">Recommended</w:t>
       </w:r>
       <w:r>
-        <w:t xml:space="preserve">: IEP,</w:t>
+        <w:t xml:space="preserve">: Steven Schneider,</w:t>
       </w:r>
       <w:r>
         <w:t xml:space="preserve"> </w:t>
@@ -2553,15 +2516,22 @@
           </w:rPr>
           <w:t xml:space="preserve">“Identity Theory”</w:t>
         </w:r>
-        <w:r>
-          <w:rPr>
-            <w:rStyle w:val="Hyperlink"/>
-          </w:rPr>
-          <w:t xml:space="preserve">, introduction</w:t>
-        </w:r>
-      </w:hyperlink>
-      <w:r>
-        <w:t xml:space="preserve">; and Princess Elisabeth of Bohemia and Descartes,</w:t>
+      </w:hyperlink>
+      <w:r>
+        <w:t xml:space="preserve">, IEP, introduction.</w:t>
+      </w:r>
+      <w:r>
+        <w:br/>
+      </w:r>
+      <w:r>
+        <w:rPr>
+          <w:b/>
+          <w:bCs/>
+        </w:rPr>
+        <w:t xml:space="preserve">Recommended</w:t>
+      </w:r>
+      <w:r>
+        <w:t xml:space="preserve">: Princess Elisabeth of Bohemia and René Descartes,</w:t>
       </w:r>
       <w:r>
         <w:t xml:space="preserve"> </w:t>
@@ -2571,7 +2541,7 @@
           <w:rPr>
             <w:rStyle w:val="Hyperlink"/>
           </w:rPr>
-          <w:t xml:space="preserve">correspondence of 1643</w:t>
+          <w:t xml:space="preserve">Correspondence of 1643</w:t>
         </w:r>
       </w:hyperlink>
       <w:r>
@@ -2663,11 +2633,9 @@
       <w:r>
         <w:t xml:space="preserve">(1000-Word Philosophy).</w:t>
       </w:r>
-    </w:p>
-    <w:p>
-      <w:pPr>
-        <w:pStyle w:val="BodyText"/>
-      </w:pPr>
+      <w:r>
+        <w:br/>
+      </w:r>
       <w:r>
         <w:rPr>
           <w:b/>
@@ -2697,11 +2665,9 @@
       <w:r>
         <w:t xml:space="preserve">ch. 2, first five paragraphs (extract posted to Canvas).</w:t>
       </w:r>
-    </w:p>
-    <w:p>
-      <w:pPr>
-        <w:pStyle w:val="BodyText"/>
-      </w:pPr>
+      <w:r>
+        <w:br/>
+      </w:r>
       <w:r>
         <w:rPr>
           <w:b/>
@@ -2710,7 +2676,7 @@
         <w:t xml:space="preserve">Recommended</w:t>
       </w:r>
       <w:r>
-        <w:t xml:space="preserve">: SEP,</w:t>
+        <w:t xml:space="preserve">: Walter Sinnott-Armstrong ,</w:t>
       </w:r>
       <w:r>
         <w:t xml:space="preserve"> </w:t>
@@ -2724,7 +2690,20 @@
         </w:r>
       </w:hyperlink>
       <w:r>
-        <w:t xml:space="preserve">, §1,</w:t>
+        <w:t xml:space="preserve">, SEP,</w:t>
+      </w:r>
+      <w:r>
+        <w:t xml:space="preserve"> </w:t>
+      </w:r>
+      <w:r>
+        <w:rPr>
+          <w:b/>
+          <w:bCs/>
+        </w:rPr>
+        <w:t xml:space="preserve">§1</w:t>
+      </w:r>
+      <w:r>
+        <w:t xml:space="preserve">,</w:t>
       </w:r>
       <w:r>
         <w:t xml:space="preserve"> </w:t>
@@ -2784,11 +2763,9 @@
       <w:r>
         <w:t xml:space="preserve">(1000-Word Philosophy).</w:t>
       </w:r>
-    </w:p>
-    <w:p>
-      <w:pPr>
-        <w:pStyle w:val="BodyText"/>
-      </w:pPr>
+      <w:r>
+        <w:br/>
+      </w:r>
       <w:r>
         <w:rPr>
           <w:b/>
@@ -2797,7 +2774,7 @@
         <w:t xml:space="preserve">Recommended</w:t>
       </w:r>
       <w:r>
-        <w:t xml:space="preserve">: SEP,</w:t>
+        <w:t xml:space="preserve">: Larry Alexander and Michael Moore,</w:t>
       </w:r>
       <w:r>
         <w:t xml:space="preserve"> </w:t>
@@ -2811,10 +2788,20 @@
         </w:r>
       </w:hyperlink>
       <w:r>
-        <w:t xml:space="preserve"> </w:t>
-      </w:r>
-      <w:r>
-        <w:t xml:space="preserve">§1,</w:t>
+        <w:t xml:space="preserve">, SEP,</w:t>
+      </w:r>
+      <w:r>
+        <w:t xml:space="preserve"> </w:t>
+      </w:r>
+      <w:r>
+        <w:rPr>
+          <w:b/>
+          <w:bCs/>
+        </w:rPr>
+        <w:t xml:space="preserve">§1</w:t>
+      </w:r>
+      <w:r>
+        <w:t xml:space="preserve">,</w:t>
       </w:r>
       <w:r>
         <w:t xml:space="preserve"> </w:t>
@@ -2823,7 +2810,20 @@
         <w:t xml:space="preserve">“Deontology’s Foil: Consequentialism”</w:t>
       </w:r>
       <w:r>
-        <w:t xml:space="preserve">; and Immanuel Kant,</w:t>
+        <w:t xml:space="preserve">.</w:t>
+      </w:r>
+      <w:r>
+        <w:br/>
+      </w:r>
+      <w:r>
+        <w:rPr>
+          <w:b/>
+          <w:bCs/>
+        </w:rPr>
+        <w:t xml:space="preserve">Recommended</w:t>
+      </w:r>
+      <w:r>
+        <w:t xml:space="preserve">: Immanuel Kant,</w:t>
       </w:r>
       <w:r>
         <w:t xml:space="preserve"> </w:t>
@@ -2835,17 +2835,11 @@
             <w:i/>
             <w:iCs/>
           </w:rPr>
-          <w:t xml:space="preserve">Groundwork</w:t>
-        </w:r>
-        <w:r>
-          <w:rPr>
-            <w:rStyle w:val="Hyperlink"/>
-          </w:rPr>
-          <w:t xml:space="preserve">, Section I</w:t>
-        </w:r>
-      </w:hyperlink>
-      <w:r>
-        <w:t xml:space="preserve">, especially the opening on the good will and the passages on universal law.</w:t>
+          <w:t xml:space="preserve">Groundwork for the Metaphysic of Morals</w:t>
+        </w:r>
+      </w:hyperlink>
+      <w:r>
+        <w:t xml:space="preserve">, translated by Jonathan Bennett, Chapter 1, especially the opening on the good will and the passages on universal law.</w:t>
       </w:r>
     </w:p>
     <w:bookmarkEnd w:id="76"/>
@@ -2889,11 +2883,9 @@
       <w:r>
         <w:t xml:space="preserve">(1000-Word Philosophy).</w:t>
       </w:r>
-    </w:p>
-    <w:p>
-      <w:pPr>
-        <w:pStyle w:val="BodyText"/>
-      </w:pPr>
+      <w:r>
+        <w:br/>
+      </w:r>
       <w:r>
         <w:rPr>
           <w:b/>
@@ -2921,7 +2913,7 @@
     </w:p>
     <w:bookmarkEnd w:id="79"/>
     <w:bookmarkEnd w:id="80"/>
-    <w:bookmarkStart w:id="86" w:name="week-10-what-makes-a-life-go-well"/>
+    <w:bookmarkStart w:id="87" w:name="week-10-what-makes-a-life-go-well"/>
     <w:p>
       <w:pPr>
         <w:pStyle w:val="Heading2"/>
@@ -2967,63 +2959,174 @@
       <w:r>
         <w:t xml:space="preserve">, the introduction.</w:t>
       </w:r>
+      <w:r>
+        <w:br/>
+      </w:r>
+      <w:r>
+        <w:rPr>
+          <w:b/>
+          <w:bCs/>
+        </w:rPr>
+        <w:t xml:space="preserve">Required</w:t>
+      </w:r>
+      <w:r>
+        <w:t xml:space="preserve">: Roger Crisp,</w:t>
+      </w:r>
+      <w:r>
+        <w:t xml:space="preserve"> </w:t>
+      </w:r>
+      <w:hyperlink r:id="rId82">
+        <w:r>
+          <w:rPr>
+            <w:rStyle w:val="Hyperlink"/>
+          </w:rPr>
+          <w:t xml:space="preserve">“Well-Being”</w:t>
+        </w:r>
+      </w:hyperlink>
+      <w:r>
+        <w:t xml:space="preserve">, SEP,</w:t>
+      </w:r>
+      <w:r>
+        <w:t xml:space="preserve"> </w:t>
+      </w:r>
+      <w:r>
+        <w:rPr>
+          <w:b/>
+          <w:bCs/>
+        </w:rPr>
+        <w:t xml:space="preserve">§1</w:t>
+      </w:r>
+      <w:r>
+        <w:t xml:space="preserve">,</w:t>
+      </w:r>
+      <w:r>
+        <w:t xml:space="preserve"> </w:t>
+      </w:r>
+      <w:r>
+        <w:t xml:space="preserve">“The Concept.”</w:t>
+      </w:r>
+    </w:p>
+    <w:bookmarkEnd w:id="83"/>
+    <w:bookmarkStart w:id="86" w:name="thursday-november-05-lecture-19-hedonism"/>
+    <w:p>
+      <w:pPr>
+        <w:pStyle w:val="Heading3"/>
+      </w:pPr>
+      <w:r>
+        <w:t xml:space="preserve">Thursday, November 05 (Lecture 19) — Hedonism</w:t>
+      </w:r>
+    </w:p>
+    <w:p>
+      <w:pPr>
+        <w:pStyle w:val="FirstParagraph"/>
+      </w:pPr>
+      <w:r>
+        <w:rPr>
+          <w:b/>
+          <w:bCs/>
+        </w:rPr>
+        <w:t xml:space="preserve">Required</w:t>
+      </w:r>
+      <w:r>
+        <w:t xml:space="preserve">: Roger Crisp,</w:t>
+      </w:r>
+      <w:r>
+        <w:t xml:space="preserve"> </w:t>
+      </w:r>
+      <w:hyperlink r:id="rId84">
+        <w:r>
+          <w:rPr>
+            <w:rStyle w:val="Hyperlink"/>
+          </w:rPr>
+          <w:t xml:space="preserve">“Well-Being”</w:t>
+        </w:r>
+      </w:hyperlink>
+      <w:r>
+        <w:t xml:space="preserve">, SEP,</w:t>
+      </w:r>
+      <w:r>
+        <w:t xml:space="preserve"> </w:t>
+      </w:r>
+      <w:r>
+        <w:rPr>
+          <w:b/>
+          <w:bCs/>
+        </w:rPr>
+        <w:t xml:space="preserve">§4.1</w:t>
+      </w:r>
+      <w:r>
+        <w:t xml:space="preserve">,</w:t>
+      </w:r>
+      <w:r>
+        <w:t xml:space="preserve"> </w:t>
+      </w:r>
+      <w:r>
+        <w:t xml:space="preserve">“Hedonism.”</w:t>
+      </w:r>
+      <w:r>
+        <w:br/>
+      </w:r>
+      <w:r>
+        <w:rPr>
+          <w:b/>
+          <w:bCs/>
+        </w:rPr>
+        <w:t xml:space="preserve">Required</w:t>
+      </w:r>
+      <w:r>
+        <w:t xml:space="preserve">: Robert Nozick,</w:t>
+      </w:r>
+      <w:r>
+        <w:t xml:space="preserve"> </w:t>
+      </w:r>
+      <w:hyperlink r:id="rId85">
+        <w:r>
+          <w:rPr>
+            <w:rStyle w:val="Hyperlink"/>
+          </w:rPr>
+          <w:t xml:space="preserve">“The Experience Machine”</w:t>
+        </w:r>
+      </w:hyperlink>
+      <w:r>
+        <w:t xml:space="preserve">. (This is just a two page excerpt.)</w:t>
+      </w:r>
     </w:p>
     <w:p>
       <w:pPr>
         <w:pStyle w:val="BodyText"/>
       </w:pPr>
-      <w:r>
-        <w:rPr>
-          <w:b/>
-          <w:bCs/>
-        </w:rPr>
-        <w:t xml:space="preserve">Required</w:t>
-      </w:r>
-      <w:r>
-        <w:t xml:space="preserve">: Roger Crisp,</w:t>
-      </w:r>
-      <w:r>
-        <w:t xml:space="preserve"> </w:t>
-      </w:r>
-      <w:hyperlink r:id="rId82">
-        <w:r>
-          <w:rPr>
-            <w:rStyle w:val="Hyperlink"/>
-          </w:rPr>
-          <w:t xml:space="preserve">“Well-Being”</w:t>
-        </w:r>
-      </w:hyperlink>
-      <w:r>
-        <w:t xml:space="preserve">,</w:t>
-      </w:r>
-      <w:r>
-        <w:t xml:space="preserve"> </w:t>
-      </w:r>
       <w:r>
         <w:rPr>
           <w:i/>
           <w:iCs/>
         </w:rPr>
-        <w:t xml:space="preserve">Stanford Encyclopedia of Philosophy</w:t>
-      </w:r>
-      <w:r>
-        <w:t xml:space="preserve">, §1,</w:t>
-      </w:r>
-      <w:r>
-        <w:t xml:space="preserve"> </w:t>
-      </w:r>
-      <w:r>
-        <w:t xml:space="preserve">“The Concept.”</w:t>
-      </w:r>
-    </w:p>
-    <w:bookmarkEnd w:id="83"/>
-    <w:bookmarkStart w:id="85" w:name="thursday-november-05-lecture-19-hedonism"/>
+        <w:t xml:space="preserve">Short Answer 2 comes back Friday, with the essay question.</w:t>
+      </w:r>
+      <w:r>
+        <w:t xml:space="preserve"> </w:t>
+      </w:r>
+      <w:r>
+        <w:t xml:space="preserve">(AGAIN, IT MIGHT BE BEST TO DISTRIBUTE ESSAY QUESTIONS EARLIER)</w:t>
+      </w:r>
+    </w:p>
+    <w:bookmarkEnd w:id="86"/>
+    <w:bookmarkEnd w:id="87"/>
+    <w:bookmarkStart w:id="94" w:name="week-11-desire-and-the-objective-list"/>
+    <w:p>
+      <w:pPr>
+        <w:pStyle w:val="Heading2"/>
+      </w:pPr>
+      <w:r>
+        <w:t xml:space="preserve">Week 11: Desire, and the Objective List</w:t>
+      </w:r>
+    </w:p>
+    <w:bookmarkStart w:id="89" w:name="X79631354aa8d6bc57231d28d4dc4739aa6c34da"/>
     <w:p>
       <w:pPr>
         <w:pStyle w:val="Heading3"/>
       </w:pPr>
       <w:r>
-        <w:t xml:space="preserve">Thursday, November 05 (Lecture 19) — Hedonism</w:t>
+        <w:t xml:space="preserve">Tuesday, November 10 (Lecture 20) — Desire and preference theories</w:t>
       </w:r>
     </w:p>
     <w:p>
@@ -3038,7 +3141,95 @@
         <w:t xml:space="preserve">Required</w:t>
       </w:r>
       <w:r>
-        <w:t xml:space="preserve">: SEP,</w:t>
+        <w:t xml:space="preserve">: Roger Crisp,</w:t>
+      </w:r>
+      <w:r>
+        <w:t xml:space="preserve"> </w:t>
+      </w:r>
+      <w:hyperlink r:id="rId88">
+        <w:r>
+          <w:rPr>
+            <w:rStyle w:val="Hyperlink"/>
+          </w:rPr>
+          <w:t xml:space="preserve">“Well-Being”</w:t>
+        </w:r>
+      </w:hyperlink>
+      <w:r>
+        <w:t xml:space="preserve">, SEP,</w:t>
+      </w:r>
+      <w:r>
+        <w:t xml:space="preserve"> </w:t>
+      </w:r>
+      <w:r>
+        <w:rPr>
+          <w:b/>
+          <w:bCs/>
+        </w:rPr>
+        <w:t xml:space="preserve">§4.2</w:t>
+      </w:r>
+      <w:r>
+        <w:t xml:space="preserve">,</w:t>
+      </w:r>
+      <w:r>
+        <w:t xml:space="preserve"> </w:t>
+      </w:r>
+      <w:r>
+        <w:t xml:space="preserve">“Desire Theories”</w:t>
+      </w:r>
+      <w:r>
+        <w:t xml:space="preserve">.</w:t>
+      </w:r>
+      <w:r>
+        <w:br/>
+      </w:r>
+      <w:r>
+        <w:rPr>
+          <w:b/>
+          <w:bCs/>
+        </w:rPr>
+        <w:t xml:space="preserve">Recommended</w:t>
+      </w:r>
+      <w:r>
+        <w:t xml:space="preserve">: Richard Y. Chappell and Darius Meissner,</w:t>
+      </w:r>
+      <w:r>
+        <w:t xml:space="preserve"> </w:t>
+      </w:r>
+      <w:hyperlink r:id="rId81">
+        <w:r>
+          <w:rPr>
+            <w:rStyle w:val="Hyperlink"/>
+          </w:rPr>
+          <w:t xml:space="preserve">“Theories of Well-Being”</w:t>
+        </w:r>
+      </w:hyperlink>
+      <w:r>
+        <w:t xml:space="preserve">, the desire-theory section.</w:t>
+      </w:r>
+    </w:p>
+    <w:bookmarkEnd w:id="89"/>
+    <w:bookmarkStart w:id="93" w:name="X10a570f0a704e9c5b54652dbcd8cc810abb2eca"/>
+    <w:p>
+      <w:pPr>
+        <w:pStyle w:val="Heading3"/>
+      </w:pPr>
+      <w:r>
+        <w:t xml:space="preserve">Thursday, November 12 (Lecture 21) — Objective lists, and who has a welfare</w:t>
+      </w:r>
+    </w:p>
+    <w:p>
+      <w:pPr>
+        <w:pStyle w:val="FirstParagraph"/>
+      </w:pPr>
+      <w:r>
+        <w:rPr>
+          <w:b/>
+          <w:bCs/>
+        </w:rPr>
+        <w:t xml:space="preserve">Required</w:t>
+      </w:r>
+      <w:r>
+        <w:t xml:space="preserve">: Roger Crisp,</w:t>
       </w:r>
       <w:r>
         <w:t xml:space="preserve"> </w:t>
@@ -3052,19 +3243,30 @@
         </w:r>
       </w:hyperlink>
       <w:r>
-        <w:t xml:space="preserve">, §4.1,</w:t>
-      </w:r>
-      <w:r>
-        <w:t xml:space="preserve"> </w:t>
-      </w:r>
-      <w:r>
-        <w:t xml:space="preserve">“Hedonism.”</w:t>
-      </w:r>
-    </w:p>
-    <w:p>
-      <w:pPr>
-        <w:pStyle w:val="BodyText"/>
-      </w:pPr>
+        <w:t xml:space="preserve">, SEP,</w:t>
+      </w:r>
+      <w:r>
+        <w:t xml:space="preserve"> </w:t>
+      </w:r>
+      <w:r>
+        <w:rPr>
+          <w:b/>
+          <w:bCs/>
+        </w:rPr>
+        <w:t xml:space="preserve">§4.3</w:t>
+      </w:r>
+      <w:r>
+        <w:t xml:space="preserve">,</w:t>
+      </w:r>
+      <w:r>
+        <w:t xml:space="preserve"> </w:t>
+      </w:r>
+      <w:r>
+        <w:t xml:space="preserve">“Objective List Theories.”</w:t>
+      </w:r>
+      <w:r>
+        <w:br/>
+      </w:r>
       <w:r>
         <w:rPr>
           <w:b/>
@@ -3073,59 +3275,180 @@
         <w:t xml:space="preserve">Required</w:t>
       </w:r>
       <w:r>
-        <w:t xml:space="preserve">: Robert Nozick,</w:t>
-      </w:r>
-      <w:r>
-        <w:t xml:space="preserve"> </w:t>
-      </w:r>
-      <w:hyperlink r:id="rId84">
-        <w:r>
-          <w:rPr>
-            <w:rStyle w:val="Hyperlink"/>
-          </w:rPr>
-          <w:t xml:space="preserve">“The Experience Machine”</w:t>
-        </w:r>
-      </w:hyperlink>
-      <w:r>
-        <w:t xml:space="preserve">. (This is just a two page excerpt.)</w:t>
-      </w:r>
-    </w:p>
-    <w:p>
-      <w:pPr>
-        <w:pStyle w:val="BodyText"/>
-      </w:pPr>
+        <w:t xml:space="preserve">: Lori Gruen and Susana Monsó,</w:t>
+      </w:r>
+      <w:r>
+        <w:t xml:space="preserve"> </w:t>
+      </w:r>
+      <w:hyperlink r:id="rId90">
+        <w:r>
+          <w:rPr>
+            <w:rStyle w:val="Hyperlink"/>
+          </w:rPr>
+          <w:t xml:space="preserve">“The Moral Status of Animals”</w:t>
+        </w:r>
+      </w:hyperlink>
+      <w:r>
+        <w:t xml:space="preserve">, SEP,</w:t>
+      </w:r>
+      <w:r>
+        <w:t xml:space="preserve"> </w:t>
+      </w:r>
+      <w:r>
+        <w:rPr>
+          <w:b/>
+          <w:bCs/>
+        </w:rPr>
+        <w:t xml:space="preserve">§1.1</w:t>
+      </w:r>
+      <w:r>
+        <w:t xml:space="preserve">,</w:t>
+      </w:r>
+      <w:r>
+        <w:t xml:space="preserve"> </w:t>
+      </w:r>
+      <w:r>
+        <w:t xml:space="preserve">“Speciesism”</w:t>
+      </w:r>
+      <w:r>
+        <w:t xml:space="preserve"> </w:t>
+      </w:r>
+      <w:r>
+        <w:t xml:space="preserve">and</w:t>
+      </w:r>
+      <w:r>
+        <w:t xml:space="preserve"> </w:t>
+      </w:r>
+      <w:r>
+        <w:rPr>
+          <w:b/>
+          <w:bCs/>
+        </w:rPr>
+        <w:t xml:space="preserve">§1.4</w:t>
+      </w:r>
+      <w:r>
+        <w:t xml:space="preserve">,</w:t>
+      </w:r>
+      <w:r>
+        <w:t xml:space="preserve"> </w:t>
+      </w:r>
+      <w:r>
+        <w:t xml:space="preserve">“Sentience”</w:t>
+      </w:r>
+      <w:r>
+        <w:t xml:space="preserve">.</w:t>
+      </w:r>
+      <w:r>
+        <w:br/>
+      </w:r>
+      <w:r>
+        <w:rPr>
+          <w:b/>
+          <w:bCs/>
+        </w:rPr>
+        <w:t xml:space="preserve">Recommended</w:t>
+      </w:r>
+      <w:r>
+        <w:t xml:space="preserve">: Conor Purcell,</w:t>
+      </w:r>
+      <w:r>
+        <w:t xml:space="preserve"> </w:t>
+      </w:r>
+      <w:hyperlink r:id="rId91">
+        <w:r>
+          <w:rPr>
+            <w:rStyle w:val="Hyperlink"/>
+          </w:rPr>
+          <w:t xml:space="preserve">“If AIs Can Feel Pain, What Is Our Responsibility Towards Them?”</w:t>
+        </w:r>
+      </w:hyperlink>
+      <w:r>
+        <w:t xml:space="preserve">,</w:t>
+      </w:r>
+      <w:r>
+        <w:t xml:space="preserve"> </w:t>
+      </w:r>
       <w:r>
         <w:rPr>
           <w:i/>
           <w:iCs/>
         </w:rPr>
-        <w:t xml:space="preserve">Short Answer 2 comes back Friday, with the essay question.</w:t>
-      </w:r>
-      <w:r>
-        <w:t xml:space="preserve"> </w:t>
-      </w:r>
-      <w:r>
-        <w:t xml:space="preserve">(AGAIN, IT MIGHT BE BEST TO DISTRIBUTE ESSAY QUESTIONS EARLIER)</w:t>
-      </w:r>
-    </w:p>
-    <w:bookmarkEnd w:id="85"/>
-    <w:bookmarkEnd w:id="86"/>
-    <w:bookmarkStart w:id="93" w:name="week-11-desire-and-the-objective-list"/>
+        <w:t xml:space="preserve">Aeon</w:t>
+      </w:r>
+      <w:r>
+        <w:t xml:space="preserve">.</w:t>
+      </w:r>
+      <w:r>
+        <w:br/>
+      </w:r>
+      <w:r>
+        <w:rPr>
+          <w:b/>
+          <w:bCs/>
+        </w:rPr>
+        <w:t xml:space="preserve">Recommended</w:t>
+      </w:r>
+      <w:r>
+        <w:t xml:space="preserve">: Walter Sinnott-Armstrong and Vincent Conitzer,</w:t>
+      </w:r>
+      <w:r>
+        <w:t xml:space="preserve"> </w:t>
+      </w:r>
+      <w:hyperlink r:id="rId92">
+        <w:r>
+          <w:rPr>
+            <w:rStyle w:val="Hyperlink"/>
+          </w:rPr>
+          <w:t xml:space="preserve">“How Much Moral Status Could Artificial Intelligence Ever Achieve?”</w:t>
+        </w:r>
+      </w:hyperlink>
+      <w:r>
+        <w:t xml:space="preserve">. If you are writing an essay on this topic, this is</w:t>
+      </w:r>
+      <w:r>
+        <w:t xml:space="preserve"> </w:t>
+      </w:r>
+      <w:r>
+        <w:rPr>
+          <w:b/>
+          <w:bCs/>
+        </w:rPr>
+        <w:t xml:space="preserve">Required</w:t>
+      </w:r>
+      <w:r>
+        <w:t xml:space="preserve">.</w:t>
+      </w:r>
+    </w:p>
+    <w:p>
+      <w:pPr>
+        <w:pStyle w:val="BodyText"/>
+      </w:pPr>
+      <w:r>
+        <w:rPr>
+          <w:i/>
+          <w:iCs/>
+        </w:rPr>
+        <w:t xml:space="preserve">Module Quiz 3 (Lectures 15–21) opens after class.</w:t>
+      </w:r>
+    </w:p>
+    <w:bookmarkEnd w:id="93"/>
+    <w:bookmarkEnd w:id="94"/>
+    <w:bookmarkStart w:id="103" w:name="week-12-the-self"/>
     <w:p>
       <w:pPr>
         <w:pStyle w:val="Heading2"/>
       </w:pPr>
       <w:r>
-        <w:t xml:space="preserve">Week 11: Desire, and the Objective List</w:t>
-      </w:r>
-    </w:p>
-    <w:bookmarkStart w:id="88" w:name="X79631354aa8d6bc57231d28d4dc4739aa6c34da"/>
+        <w:t xml:space="preserve">Week 12: The Self</w:t>
+      </w:r>
+    </w:p>
+    <w:bookmarkStart w:id="98" w:name="Xd41dee43ab2ae7aade769c2c5526b30fecfa0af"/>
     <w:p>
       <w:pPr>
         <w:pStyle w:val="Heading3"/>
       </w:pPr>
       <w:r>
-        <w:t xml:space="preserve">Tuesday, November 10 (Lecture 20) — Desire and preference theories</w:t>
+        <w:t xml:space="preserve">Tuesday, November 17 (Lecture 22) — Personal identity: the cases</w:t>
       </w:r>
     </w:p>
     <w:p>
@@ -3140,48 +3463,55 @@
         <w:t xml:space="preserve">Required</w:t>
       </w:r>
       <w:r>
-        <w:t xml:space="preserve">: SEP,</w:t>
-      </w:r>
-      <w:r>
-        <w:t xml:space="preserve"> </w:t>
-      </w:r>
-      <w:hyperlink r:id="rId82">
-        <w:r>
-          <w:rPr>
-            <w:rStyle w:val="Hyperlink"/>
-          </w:rPr>
-          <w:t xml:space="preserve">“Well-Being,”</w:t>
-        </w:r>
-        <w:r>
-          <w:rPr>
-            <w:rStyle w:val="Hyperlink"/>
-          </w:rPr>
-          <w:t xml:space="preserve"> </w:t>
-        </w:r>
-        <w:r>
-          <w:rPr>
-            <w:rStyle w:val="Hyperlink"/>
-          </w:rPr>
-          <w:t xml:space="preserve">§4.2,</w:t>
-        </w:r>
-        <w:r>
-          <w:rPr>
-            <w:rStyle w:val="Hyperlink"/>
-          </w:rPr>
-          <w:t xml:space="preserve"> </w:t>
-        </w:r>
-        <w:r>
-          <w:rPr>
-            <w:rStyle w:val="Hyperlink"/>
-          </w:rPr>
-          <w:t xml:space="preserve">“Desire Theories.”</w:t>
-        </w:r>
-      </w:hyperlink>
-    </w:p>
-    <w:p>
-      <w:pPr>
-        <w:pStyle w:val="BodyText"/>
-      </w:pPr>
+        <w:t xml:space="preserve">: Kristin Seemuth Whaley,</w:t>
+      </w:r>
+      <w:r>
+        <w:t xml:space="preserve"> </w:t>
+      </w:r>
+      <w:hyperlink r:id="rId95">
+        <w:r>
+          <w:rPr>
+            <w:rStyle w:val="Hyperlink"/>
+          </w:rPr>
+          <w:t xml:space="preserve">“Psychological Approaches to Personal Identity”</w:t>
+        </w:r>
+      </w:hyperlink>
+      <w:r>
+        <w:t xml:space="preserve"> </w:t>
+      </w:r>
+      <w:r>
+        <w:t xml:space="preserve">(1000-Word Philosophy).</w:t>
+      </w:r>
+      <w:r>
+        <w:br/>
+      </w:r>
+      <w:r>
+        <w:rPr>
+          <w:b/>
+          <w:bCs/>
+        </w:rPr>
+        <w:t xml:space="preserve">Required</w:t>
+      </w:r>
+      <w:r>
+        <w:t xml:space="preserve">: Derek Parfit,</w:t>
+      </w:r>
+      <w:r>
+        <w:t xml:space="preserve"> </w:t>
+      </w:r>
+      <w:hyperlink r:id="rId96">
+        <w:r>
+          <w:rPr>
+            <w:rStyle w:val="Hyperlink"/>
+          </w:rPr>
+          <w:t xml:space="preserve">“Divided Minds and the Nature of Persons”</w:t>
+        </w:r>
+      </w:hyperlink>
+      <w:r>
+        <w:t xml:space="preserve">.</w:t>
+      </w:r>
+      <w:r>
+        <w:br/>
+      </w:r>
       <w:r>
         <w:rPr>
           <w:b/>
@@ -3190,43 +3520,34 @@
         <w:t xml:space="preserve">Recommended</w:t>
       </w:r>
       <w:r>
-        <w:t xml:space="preserve">:</w:t>
-      </w:r>
-      <w:r>
-        <w:t xml:space="preserve"> </w:t>
-      </w:r>
-      <w:hyperlink r:id="rId87">
-        <w:r>
-          <w:rPr>
-            <w:rStyle w:val="Hyperlink"/>
-          </w:rPr>
-          <w:t xml:space="preserve">“Theories of Well-Being”</w:t>
-        </w:r>
-        <w:r>
-          <w:rPr>
-            <w:rStyle w:val="Hyperlink"/>
-          </w:rPr>
-          <w:t xml:space="preserve"> </w:t>
-        </w:r>
-        <w:r>
-          <w:rPr>
-            <w:rStyle w:val="Hyperlink"/>
-          </w:rPr>
-          <w:t xml:space="preserve">(utilitarianism.net), the desire-theory section</w:t>
-        </w:r>
-      </w:hyperlink>
-      <w:r>
-        <w:t xml:space="preserve">.</w:t>
-      </w:r>
-    </w:p>
-    <w:bookmarkEnd w:id="88"/>
-    <w:bookmarkStart w:id="92" w:name="X10a570f0a704e9c5b54652dbcd8cc810abb2eca"/>
+        <w:t xml:space="preserve">: Chad Vance,</w:t>
+      </w:r>
+      <w:r>
+        <w:t xml:space="preserve"> </w:t>
+      </w:r>
+      <w:hyperlink r:id="rId97">
+        <w:r>
+          <w:rPr>
+            <w:rStyle w:val="Hyperlink"/>
+          </w:rPr>
+          <w:t xml:space="preserve">“Personal Identity: How We Exist Over Time”</w:t>
+        </w:r>
+      </w:hyperlink>
+      <w:r>
+        <w:t xml:space="preserve"> </w:t>
+      </w:r>
+      <w:r>
+        <w:t xml:space="preserve">(1000-Word Philosophy).</w:t>
+      </w:r>
+    </w:p>
+    <w:bookmarkEnd w:id="98"/>
+    <w:bookmarkStart w:id="102" w:name="X7b137362c18c82fd08f57a4d05c8acf900f9e5f"/>
     <w:p>
       <w:pPr>
         <w:pStyle w:val="Heading3"/>
       </w:pPr>
       <w:r>
-        <w:t xml:space="preserve">Thursday, November 12 (Lecture 21) — Objective lists, and who has a welfare</w:t>
+        <w:t xml:space="preserve">Thursday, November 19 (Lecture 23) — What matters in survival</w:t>
       </w:r>
     </w:p>
     <w:p>
@@ -3241,146 +3562,32 @@
         <w:t xml:space="preserve">Required</w:t>
       </w:r>
       <w:r>
-        <w:t xml:space="preserve">: SEP,</w:t>
-      </w:r>
-      <w:r>
-        <w:t xml:space="preserve"> </w:t>
-      </w:r>
-      <w:hyperlink r:id="rId82">
-        <w:r>
-          <w:rPr>
-            <w:rStyle w:val="Hyperlink"/>
-          </w:rPr>
-          <w:t xml:space="preserve">“Well-Being”</w:t>
-        </w:r>
-      </w:hyperlink>
-      <w:r>
-        <w:t xml:space="preserve">, §4.3,</w:t>
-      </w:r>
-      <w:r>
-        <w:t xml:space="preserve"> </w:t>
-      </w:r>
-      <w:r>
-        <w:t xml:space="preserve">“Objective List Theories.”</w:t>
-      </w:r>
-    </w:p>
-    <w:p>
-      <w:pPr>
-        <w:pStyle w:val="BodyText"/>
-      </w:pPr>
-      <w:r>
-        <w:rPr>
-          <w:b/>
-          <w:bCs/>
-        </w:rPr>
-        <w:t xml:space="preserve">Required</w:t>
-      </w:r>
-      <w:r>
-        <w:t xml:space="preserve">:</w:t>
-      </w:r>
-      <w:r>
-        <w:t xml:space="preserve"> </w:t>
-      </w:r>
-      <w:hyperlink r:id="rId89">
-        <w:r>
-          <w:rPr>
-            <w:rStyle w:val="Hyperlink"/>
-          </w:rPr>
-          <w:t xml:space="preserve">“The Moral Status of Animals”</w:t>
-        </w:r>
-      </w:hyperlink>
-      <w:r>
-        <w:t xml:space="preserve"> </w:t>
-      </w:r>
-      <w:r>
-        <w:t xml:space="preserve">(1000-Word Philosophy).</w:t>
-      </w:r>
-    </w:p>
-    <w:p>
-      <w:pPr>
-        <w:pStyle w:val="BodyText"/>
-      </w:pPr>
-      <w:r>
-        <w:rPr>
-          <w:b/>
-          <w:bCs/>
-        </w:rPr>
-        <w:t xml:space="preserve">Recommended</w:t>
-      </w:r>
-      <w:r>
-        <w:t xml:space="preserve">:</w:t>
-      </w:r>
-      <w:r>
-        <w:t xml:space="preserve"> </w:t>
-      </w:r>
-      <w:hyperlink r:id="rId90">
-        <w:r>
-          <w:rPr>
-            <w:rStyle w:val="Hyperlink"/>
-          </w:rPr>
-          <w:t xml:space="preserve">“If AIs Can Feel Pain, What Is Our Responsibility Towards Them?”</w:t>
-        </w:r>
-        <w:r>
-          <w:rPr>
-            <w:rStyle w:val="Hyperlink"/>
-          </w:rPr>
-          <w:t xml:space="preserve"> </w:t>
-        </w:r>
-        <w:r>
-          <w:rPr>
-            <w:rStyle w:val="Hyperlink"/>
-          </w:rPr>
-          <w:t xml:space="preserve">(</w:t>
-        </w:r>
+        <w:t xml:space="preserve">: John Locke,</w:t>
+      </w:r>
+      <w:r>
+        <w:t xml:space="preserve"> </w:t>
+      </w:r>
+      <w:hyperlink r:id="rId99">
         <w:r>
           <w:rPr>
             <w:rStyle w:val="Hyperlink"/>
             <w:i/>
             <w:iCs/>
           </w:rPr>
-          <w:t xml:space="preserve">Aeon</w:t>
-        </w:r>
-        <w:r>
-          <w:rPr>
-            <w:rStyle w:val="Hyperlink"/>
-          </w:rPr>
-          <w:t xml:space="preserve">)</w:t>
-        </w:r>
-      </w:hyperlink>
-      <w:r>
-        <w:t xml:space="preserve">.</w:t>
-      </w:r>
-    </w:p>
-    <w:p>
-      <w:pPr>
-        <w:pStyle w:val="BodyText"/>
-      </w:pPr>
-      <w:r>
-        <w:rPr>
-          <w:b/>
-          <w:bCs/>
-        </w:rPr>
-        <w:t xml:space="preserve">Recommended</w:t>
-      </w:r>
-      <w:r>
-        <w:t xml:space="preserve">: Walter Sinnott-Armstrong and Vincent Conitzer,</w:t>
-      </w:r>
-      <w:r>
-        <w:t xml:space="preserve"> </w:t>
-      </w:r>
-      <w:hyperlink r:id="rId91">
-        <w:r>
-          <w:rPr>
-            <w:rStyle w:val="Hyperlink"/>
-          </w:rPr>
-          <w:t xml:space="preserve">“How Much Moral Status Could Artificial Intelligence Ever Achieve?”</w:t>
-        </w:r>
-      </w:hyperlink>
-      <w:r>
-        <w:t xml:space="preserve">. If you are writing an essay on this topic, this is</w:t>
-      </w:r>
-      <w:r>
-        <w:t xml:space="preserve"> </w:t>
+          <w:t xml:space="preserve">An Essay Concerning Human Understanding</w:t>
+        </w:r>
+        <w:r>
+          <w:rPr>
+            <w:rStyle w:val="Hyperlink"/>
+          </w:rPr>
+          <w:t xml:space="preserve">, Book II: Ideas</w:t>
+        </w:r>
+      </w:hyperlink>
+      <w:r>
+        <w:t xml:space="preserve">, Chapter xxvii, §§9, 14, and 26. (Those are on pages 115, 117, and 120.)</w:t>
+      </w:r>
+      <w:r>
+        <w:br/>
       </w:r>
       <w:r>
         <w:rPr>
@@ -3390,106 +3597,87 @@
         <w:t xml:space="preserve">Required</w:t>
       </w:r>
       <w:r>
-        <w:t xml:space="preserve">.</w:t>
-      </w:r>
-    </w:p>
-    <w:p>
-      <w:pPr>
-        <w:pStyle w:val="BodyText"/>
-      </w:pPr>
+        <w:t xml:space="preserve">: Daniel Weltman,</w:t>
+      </w:r>
+      <w:r>
+        <w:t xml:space="preserve"> </w:t>
+      </w:r>
+      <w:hyperlink r:id="rId100">
+        <w:r>
+          <w:rPr>
+            <w:rStyle w:val="Hyperlink"/>
+          </w:rPr>
+          <w:t xml:space="preserve">“The Buddhist Theory of No-Self”</w:t>
+        </w:r>
+      </w:hyperlink>
+      <w:r>
+        <w:t xml:space="preserve"> </w:t>
+      </w:r>
+      <w:r>
+        <w:t xml:space="preserve">(1000-Word Philosophy).</w:t>
+      </w:r>
+      <w:r>
+        <w:br/>
+      </w:r>
+      <w:r>
+        <w:rPr>
+          <w:b/>
+          <w:bCs/>
+        </w:rPr>
+        <w:t xml:space="preserve">Required</w:t>
+      </w:r>
+      <w:r>
+        <w:t xml:space="preserve">: Jessica Gordon-Roth,</w:t>
+      </w:r>
+      <w:r>
+        <w:t xml:space="preserve"> </w:t>
+      </w:r>
+      <w:hyperlink r:id="rId101">
+        <w:r>
+          <w:rPr>
+            <w:rStyle w:val="Hyperlink"/>
+          </w:rPr>
+          <w:t xml:space="preserve">“Locke on Personal Identity”</w:t>
+        </w:r>
+      </w:hyperlink>
+      <w:r>
+        <w:t xml:space="preserve">,</w:t>
+      </w:r>
+      <w:r>
+        <w:t xml:space="preserve"> </w:t>
+      </w:r>
       <w:r>
         <w:rPr>
           <w:i/>
           <w:iCs/>
         </w:rPr>
-        <w:t xml:space="preserve">Module Quiz 3 (Lectures 15–21) opens after class.</w:t>
-      </w:r>
-    </w:p>
-    <w:bookmarkEnd w:id="92"/>
-    <w:bookmarkEnd w:id="93"/>
-    <w:bookmarkStart w:id="102" w:name="week-12-the-self"/>
-    <w:p>
-      <w:pPr>
-        <w:pStyle w:val="Heading2"/>
-      </w:pPr>
-      <w:r>
-        <w:t xml:space="preserve">Week 12: The Self</w:t>
-      </w:r>
-    </w:p>
-    <w:bookmarkStart w:id="97" w:name="Xd41dee43ab2ae7aade769c2c5526b30fecfa0af"/>
-    <w:p>
-      <w:pPr>
-        <w:pStyle w:val="Heading3"/>
-      </w:pPr>
-      <w:r>
-        <w:t xml:space="preserve">Tuesday, November 17 (Lecture 22) — Personal identity: the cases</w:t>
-      </w:r>
-    </w:p>
-    <w:p>
-      <w:pPr>
-        <w:pStyle w:val="FirstParagraph"/>
-      </w:pPr>
-      <w:r>
-        <w:rPr>
-          <w:b/>
-          <w:bCs/>
-        </w:rPr>
-        <w:t xml:space="preserve">Required</w:t>
-      </w:r>
-      <w:r>
-        <w:t xml:space="preserve">: Kristin Seemuth Whaley,</w:t>
-      </w:r>
-      <w:r>
-        <w:t xml:space="preserve"> </w:t>
-      </w:r>
-      <w:hyperlink r:id="rId94">
-        <w:r>
-          <w:rPr>
-            <w:rStyle w:val="Hyperlink"/>
-          </w:rPr>
-          <w:t xml:space="preserve">“Psychological Approaches to Personal Identity”</w:t>
-        </w:r>
-      </w:hyperlink>
-      <w:r>
-        <w:t xml:space="preserve"> </w:t>
-      </w:r>
-      <w:r>
-        <w:t xml:space="preserve">(1000-Word Philosophy).</w:t>
-      </w:r>
-    </w:p>
-    <w:p>
-      <w:pPr>
-        <w:pStyle w:val="BodyText"/>
-      </w:pPr>
-      <w:r>
-        <w:rPr>
-          <w:b/>
-          <w:bCs/>
-        </w:rPr>
-        <w:t xml:space="preserve">Required</w:t>
-      </w:r>
-      <w:r>
-        <w:t xml:space="preserve">: Derek Parfit,</w:t>
-      </w:r>
-      <w:r>
-        <w:t xml:space="preserve"> </w:t>
-      </w:r>
-      <w:hyperlink r:id="rId95">
-        <w:r>
-          <w:rPr>
-            <w:rStyle w:val="Hyperlink"/>
-          </w:rPr>
-          <w:t xml:space="preserve">“Divided Minds and the Nature of Persons”</w:t>
-        </w:r>
-      </w:hyperlink>
-      <w:r>
-        <w:t xml:space="preserve">.</w:t>
-      </w:r>
-    </w:p>
-    <w:p>
-      <w:pPr>
-        <w:pStyle w:val="BodyText"/>
-      </w:pPr>
+        <w:t xml:space="preserve">Stanford Encyclopedia of Philosophy</w:t>
+      </w:r>
+      <w:r>
+        <w:t xml:space="preserve">,</w:t>
+      </w:r>
+      <w:r>
+        <w:t xml:space="preserve"> </w:t>
+      </w:r>
+      <w:r>
+        <w:rPr>
+          <w:b/>
+          <w:bCs/>
+        </w:rPr>
+        <w:t xml:space="preserve">§1</w:t>
+      </w:r>
+      <w:r>
+        <w:t xml:space="preserve">,</w:t>
+      </w:r>
+      <w:r>
+        <w:t xml:space="preserve"> </w:t>
+      </w:r>
+      <w:r>
+        <w:t xml:space="preserve">“Locke on Persons and Personal Identity: The Basics.”</w:t>
+      </w:r>
+      <w:r>
+        <w:br/>
+      </w:r>
       <w:r>
         <w:rPr>
           <w:b/>
@@ -3498,212 +3686,430 @@
         <w:t xml:space="preserve">Recommended</w:t>
       </w:r>
       <w:r>
-        <w:t xml:space="preserve">: Chad Vance,</w:t>
-      </w:r>
-      <w:r>
-        <w:t xml:space="preserve"> </w:t>
-      </w:r>
-      <w:hyperlink r:id="rId96">
-        <w:r>
-          <w:rPr>
-            <w:rStyle w:val="Hyperlink"/>
-          </w:rPr>
-          <w:t xml:space="preserve">“Personal Identity: How We Exist Over Time”</w:t>
-        </w:r>
-      </w:hyperlink>
-      <w:r>
-        <w:t xml:space="preserve"> </w:t>
-      </w:r>
-      <w:r>
-        <w:t xml:space="preserve">(1000-Word Philosophy).</w:t>
-      </w:r>
-    </w:p>
-    <w:bookmarkEnd w:id="97"/>
-    <w:bookmarkStart w:id="101" w:name="X7b137362c18c82fd08f57a4d05c8acf900f9e5f"/>
-    <w:p>
-      <w:pPr>
-        <w:pStyle w:val="Heading3"/>
-      </w:pPr>
-      <w:r>
-        <w:t xml:space="preserve">Thursday, November 19 (Lecture 23) — What matters in survival</w:t>
-      </w:r>
-    </w:p>
-    <w:p>
-      <w:pPr>
-        <w:pStyle w:val="FirstParagraph"/>
-      </w:pPr>
-      <w:r>
-        <w:rPr>
-          <w:b/>
-          <w:bCs/>
-        </w:rPr>
-        <w:t xml:space="preserve">Required</w:t>
-      </w:r>
-      <w:r>
-        <w:t xml:space="preserve">: John Locke,</w:t>
-      </w:r>
-      <w:r>
-        <w:t xml:space="preserve"> </w:t>
-      </w:r>
-      <w:hyperlink r:id="rId98">
+        <w:t xml:space="preserve">:</w:t>
+      </w:r>
+      <w:r>
+        <w:t xml:space="preserve"> </w:t>
+      </w:r>
+      <w:hyperlink r:id="rId99">
         <w:r>
           <w:rPr>
             <w:rStyle w:val="Hyperlink"/>
             <w:i/>
             <w:iCs/>
           </w:rPr>
-          <w:t xml:space="preserve">Essay</w:t>
-        </w:r>
-        <w:r>
-          <w:rPr>
-            <w:rStyle w:val="Hyperlink"/>
-          </w:rPr>
-          <w:t xml:space="preserve">, II.xxvii</w:t>
-        </w:r>
-      </w:hyperlink>
-      <w:r>
-        <w:t xml:space="preserve">, §§9, 14, and 26.</w:t>
-      </w:r>
-    </w:p>
-    <w:p>
-      <w:pPr>
-        <w:pStyle w:val="BodyText"/>
-      </w:pPr>
-      <w:r>
-        <w:rPr>
-          <w:b/>
-          <w:bCs/>
-        </w:rPr>
-        <w:t xml:space="preserve">Required</w:t>
-      </w:r>
-      <w:r>
-        <w:t xml:space="preserve">: Daniel Weltman,</w:t>
-      </w:r>
-      <w:r>
-        <w:t xml:space="preserve"> </w:t>
-      </w:r>
-      <w:hyperlink r:id="rId99">
-        <w:r>
-          <w:rPr>
-            <w:rStyle w:val="Hyperlink"/>
-          </w:rPr>
-          <w:t xml:space="preserve">“The Buddhist Theory of No-Self”</w:t>
-        </w:r>
-      </w:hyperlink>
-      <w:r>
-        <w:t xml:space="preserve"> </w:t>
-      </w:r>
-      <w:r>
-        <w:t xml:space="preserve">(1000-Word Philosophy).</w:t>
-      </w:r>
-    </w:p>
-    <w:p>
-      <w:pPr>
-        <w:pStyle w:val="BodyText"/>
-      </w:pPr>
-      <w:r>
-        <w:rPr>
-          <w:b/>
-          <w:bCs/>
-        </w:rPr>
-        <w:t xml:space="preserve">Required</w:t>
-      </w:r>
-      <w:r>
-        <w:t xml:space="preserve">: Jessica Gordon-Roth,</w:t>
-      </w:r>
-      <w:r>
-        <w:t xml:space="preserve"> </w:t>
-      </w:r>
-      <w:hyperlink r:id="rId100">
-        <w:r>
-          <w:rPr>
-            <w:rStyle w:val="Hyperlink"/>
-          </w:rPr>
-          <w:t xml:space="preserve">“Locke on Personal Identity”</w:t>
-        </w:r>
-      </w:hyperlink>
-      <w:r>
-        <w:t xml:space="preserve">,</w:t>
-      </w:r>
-      <w:r>
-        <w:t xml:space="preserve"> </w:t>
-      </w:r>
+          <w:t xml:space="preserve">An Essay Concerning Human Understanding</w:t>
+        </w:r>
+        <w:r>
+          <w:rPr>
+            <w:rStyle w:val="Hyperlink"/>
+          </w:rPr>
+          <w:t xml:space="preserve">, Book II: Ideas</w:t>
+        </w:r>
+      </w:hyperlink>
+      <w:r>
+        <w:t xml:space="preserve">, all of Chapter xxvii, for anyone who wants to see the details of Locke’s view in a more original form.</w:t>
+      </w:r>
+    </w:p>
+    <w:bookmarkEnd w:id="102"/>
+    <w:bookmarkEnd w:id="103"/>
+    <w:bookmarkStart w:id="108" w:name="week-13-law"/>
+    <w:p>
+      <w:pPr>
+        <w:pStyle w:val="Heading2"/>
+      </w:pPr>
+      <w:r>
+        <w:t xml:space="preserve">Week 13: Law</w:t>
+      </w:r>
+    </w:p>
+    <w:p>
+      <w:pPr>
+        <w:pStyle w:val="FirstParagraph"/>
+      </w:pPr>
       <w:r>
         <w:rPr>
           <w:i/>
           <w:iCs/>
         </w:rPr>
-        <w:t xml:space="preserve">Stanford Encyclopedia of Philosophy</w:t>
-      </w:r>
-      <w:r>
-        <w:t xml:space="preserve">, §1,</w:t>
-      </w:r>
-      <w:r>
-        <w:t xml:space="preserve"> </w:t>
-      </w:r>
-      <w:r>
-        <w:t xml:space="preserve">“Locke on Persons and Personal Identity: The Basics.”</w:t>
+        <w:t xml:space="preserve">Essay due Monday, November 23.</w:t>
+      </w:r>
+    </w:p>
+    <w:bookmarkStart w:id="106" w:name="Xa4bb28432e14a88f4742351691505a49b1698c4"/>
+    <w:p>
+      <w:pPr>
+        <w:pStyle w:val="Heading3"/>
+      </w:pPr>
+      <w:r>
+        <w:t xml:space="preserve">Tuesday, November 24 (Lecture 24) — Why obey the law?</w:t>
+      </w:r>
+    </w:p>
+    <w:p>
+      <w:pPr>
+        <w:pStyle w:val="FirstParagraph"/>
+      </w:pPr>
+      <w:r>
+        <w:rPr>
+          <w:b/>
+          <w:bCs/>
+        </w:rPr>
+        <w:t xml:space="preserve">Required</w:t>
+      </w:r>
+      <w:r>
+        <w:t xml:space="preserve">: John Protevi,</w:t>
+      </w:r>
+      <w:r>
+        <w:t xml:space="preserve"> </w:t>
+      </w:r>
+      <w:hyperlink r:id="rId104">
+        <w:r>
+          <w:rPr>
+            <w:rStyle w:val="Hyperlink"/>
+          </w:rPr>
+          <w:t xml:space="preserve">“Plato’s</w:t>
+        </w:r>
+        <w:r>
+          <w:rPr>
+            <w:rStyle w:val="Hyperlink"/>
+          </w:rPr>
+          <w:t xml:space="preserve"> </w:t>
+        </w:r>
+        <w:r>
+          <w:rPr>
+            <w:rStyle w:val="Hyperlink"/>
+            <w:i/>
+            <w:iCs/>
+          </w:rPr>
+          <w:t xml:space="preserve">Crito</w:t>
+        </w:r>
+        <w:r>
+          <w:rPr>
+            <w:rStyle w:val="Hyperlink"/>
+          </w:rPr>
+          <w:t xml:space="preserve">”</w:t>
+        </w:r>
+      </w:hyperlink>
+      <w:r>
+        <w:t xml:space="preserve">. Read this first.</w:t>
+      </w:r>
+      <w:r>
+        <w:br/>
+      </w:r>
+      <w:r>
+        <w:rPr>
+          <w:b/>
+          <w:bCs/>
+        </w:rPr>
+        <w:t xml:space="preserve">Required</w:t>
+      </w:r>
+      <w:r>
+        <w:t xml:space="preserve">: Plato,</w:t>
+      </w:r>
+      <w:r>
+        <w:t xml:space="preserve"> </w:t>
+      </w:r>
+      <w:hyperlink r:id="rId105">
+        <w:r>
+          <w:rPr>
+            <w:rStyle w:val="Hyperlink"/>
+            <w:i/>
+            <w:iCs/>
+          </w:rPr>
+          <w:t xml:space="preserve">Crito</w:t>
+        </w:r>
+      </w:hyperlink>
+      <w:r>
+        <w:t xml:space="preserve">. (Jowett translation, Project Gutenberg)</w:t>
+      </w:r>
+    </w:p>
+    <w:bookmarkEnd w:id="106"/>
+    <w:bookmarkStart w:id="107" w:name="X1409287e655faaa706d560809809ecb7d412b48"/>
+    <w:p>
+      <w:pPr>
+        <w:pStyle w:val="Heading3"/>
+      </w:pPr>
+      <w:r>
+        <w:t xml:space="preserve">Thursday, November 26 — Thanksgiving recess, no class</w:t>
+      </w:r>
+    </w:p>
+    <w:bookmarkEnd w:id="107"/>
+    <w:bookmarkEnd w:id="108"/>
+    <w:bookmarkStart w:id="115" w:name="week-14-punishment-and-speech"/>
+    <w:p>
+      <w:pPr>
+        <w:pStyle w:val="Heading2"/>
+      </w:pPr>
+      <w:r>
+        <w:t xml:space="preserve">Week 14: Punishment and Speech</w:t>
+      </w:r>
+    </w:p>
+    <w:bookmarkStart w:id="111" w:name="X79a81136425caf0487efa9b62b3f24f30bbda61"/>
+    <w:p>
+      <w:pPr>
+        <w:pStyle w:val="Heading3"/>
+      </w:pPr>
+      <w:r>
+        <w:t xml:space="preserve">Tuesday, December 01 (Lecture 25) — Theories of punishment</w:t>
+      </w:r>
+    </w:p>
+    <w:p>
+      <w:pPr>
+        <w:pStyle w:val="FirstParagraph"/>
+      </w:pPr>
+      <w:r>
+        <w:rPr>
+          <w:b/>
+          <w:bCs/>
+        </w:rPr>
+        <w:t xml:space="preserve">Required</w:t>
+      </w:r>
+      <w:r>
+        <w:t xml:space="preserve">: Travis Joseph Rodgers,</w:t>
+      </w:r>
+      <w:r>
+        <w:t xml:space="preserve"> </w:t>
+      </w:r>
+      <w:hyperlink r:id="rId109">
+        <w:r>
+          <w:rPr>
+            <w:rStyle w:val="Hyperlink"/>
+          </w:rPr>
+          <w:t xml:space="preserve">“Theories of Punishment”</w:t>
+        </w:r>
+      </w:hyperlink>
+      <w:r>
+        <w:t xml:space="preserve"> </w:t>
+      </w:r>
+      <w:r>
+        <w:t xml:space="preserve">(1000-Word Philosophy).</w:t>
+      </w:r>
+      <w:r>
+        <w:br/>
+      </w:r>
+      <w:r>
+        <w:rPr>
+          <w:b/>
+          <w:bCs/>
+        </w:rPr>
+        <w:t xml:space="preserve">Recommended</w:t>
+      </w:r>
+      <w:r>
+        <w:t xml:space="preserve">: Zachary Hoskins and Anthony Duff,</w:t>
+      </w:r>
+      <w:r>
+        <w:t xml:space="preserve"> </w:t>
+      </w:r>
+      <w:hyperlink r:id="rId110">
+        <w:r>
+          <w:rPr>
+            <w:rStyle w:val="Hyperlink"/>
+          </w:rPr>
+          <w:t xml:space="preserve">“Legal Punishment”</w:t>
+        </w:r>
+      </w:hyperlink>
+      <w:r>
+        <w:t xml:space="preserve">, SEP,</w:t>
+      </w:r>
+      <w:r>
+        <w:t xml:space="preserve"> </w:t>
+      </w:r>
+      <w:r>
+        <w:rPr>
+          <w:b/>
+          <w:bCs/>
+        </w:rPr>
+        <w:t xml:space="preserve">§3-4</w:t>
+      </w:r>
+      <w:r>
+        <w:t xml:space="preserve">,</w:t>
+      </w:r>
+      <w:r>
+        <w:t xml:space="preserve"> </w:t>
+      </w:r>
+      <w:r>
+        <w:t xml:space="preserve">“Consequentialist Accounts”</w:t>
+      </w:r>
+      <w:r>
+        <w:t xml:space="preserve"> </w:t>
+      </w:r>
+      <w:r>
+        <w:t xml:space="preserve">and</w:t>
+      </w:r>
+      <w:r>
+        <w:t xml:space="preserve"> </w:t>
+      </w:r>
+      <w:r>
+        <w:t xml:space="preserve">“Retributivist Accounts”</w:t>
+      </w:r>
+      <w:r>
+        <w:t xml:space="preserve">.</w:t>
+      </w:r>
+    </w:p>
+    <w:bookmarkEnd w:id="111"/>
+    <w:bookmarkStart w:id="114" w:name="X9a2df436863387c404aa2d0a9ac8b7fb026d883"/>
+    <w:p>
+      <w:pPr>
+        <w:pStyle w:val="Heading3"/>
+      </w:pPr>
+      <w:r>
+        <w:t xml:space="preserve">Thursday, December 03 (Lecture 26) — Free speech and the marketplace of ideas</w:t>
+      </w:r>
+    </w:p>
+    <w:p>
+      <w:pPr>
+        <w:pStyle w:val="FirstParagraph"/>
+      </w:pPr>
+      <w:r>
+        <w:rPr>
+          <w:b/>
+          <w:bCs/>
+        </w:rPr>
+        <w:t xml:space="preserve">Required</w:t>
+      </w:r>
+      <w:r>
+        <w:t xml:space="preserve">: Mark Satta,</w:t>
+      </w:r>
+      <w:r>
+        <w:t xml:space="preserve"> </w:t>
+      </w:r>
+      <w:hyperlink r:id="rId112">
+        <w:r>
+          <w:rPr>
+            <w:rStyle w:val="Hyperlink"/>
+          </w:rPr>
+          <w:t xml:space="preserve">“Free Speech”</w:t>
+        </w:r>
+      </w:hyperlink>
+      <w:r>
+        <w:t xml:space="preserve"> </w:t>
+      </w:r>
+      <w:r>
+        <w:t xml:space="preserve">(1000-Word Philosophy)</w:t>
+      </w:r>
+      <w:r>
+        <w:br/>
+      </w:r>
+      <w:r>
+        <w:rPr>
+          <w:b/>
+          <w:bCs/>
+        </w:rPr>
+        <w:t xml:space="preserve">Required</w:t>
+      </w:r>
+      <w:r>
+        <w:t xml:space="preserve">: J. S. Mill and H. T. Mill,</w:t>
+      </w:r>
+      <w:r>
+        <w:t xml:space="preserve"> </w:t>
+      </w:r>
+      <w:hyperlink r:id="rId113">
+        <w:r>
+          <w:rPr>
+            <w:rStyle w:val="Hyperlink"/>
+            <w:i/>
+            <w:iCs/>
+          </w:rPr>
+          <w:t xml:space="preserve">On Liberty</w:t>
+        </w:r>
+      </w:hyperlink>
+      <w:r>
+        <w:t xml:space="preserve">, extract from Chapter 2 on Canvas.</w:t>
+      </w:r>
+    </w:p>
+    <w:bookmarkEnd w:id="114"/>
+    <w:bookmarkEnd w:id="115"/>
+    <w:bookmarkStart w:id="119" w:name="week-15-ending"/>
+    <w:p>
+      <w:pPr>
+        <w:pStyle w:val="Heading2"/>
+      </w:pPr>
+      <w:r>
+        <w:t xml:space="preserve">Week 15: Ending</w:t>
+      </w:r>
+    </w:p>
+    <w:bookmarkStart w:id="117" w:name="X743a790e5d5be054d57feee6607a1932d6cb600"/>
+    <w:p>
+      <w:pPr>
+        <w:pStyle w:val="Heading3"/>
+      </w:pPr>
+      <w:r>
+        <w:t xml:space="preserve">Tuesday, December 08 (Lecture 27) — Does the marketplace track truth?</w:t>
+      </w:r>
+    </w:p>
+    <w:p>
+      <w:pPr>
+        <w:pStyle w:val="FirstParagraph"/>
+      </w:pPr>
+      <w:r>
+        <w:rPr>
+          <w:b/>
+          <w:bCs/>
+        </w:rPr>
+        <w:t xml:space="preserve">Required</w:t>
+      </w:r>
+      <w:r>
+        <w:t xml:space="preserve">: David V. Johnson,</w:t>
+      </w:r>
+      <w:r>
+        <w:t xml:space="preserve"> </w:t>
+      </w:r>
+      <w:hyperlink r:id="rId116">
+        <w:r>
+          <w:rPr>
+            <w:rStyle w:val="Hyperlink"/>
+          </w:rPr>
+          <w:t xml:space="preserve">“How do we pry apart the true and compelling from the false and toxic?”</w:t>
+        </w:r>
+        <w:r>
+          <w:rPr>
+            <w:rStyle w:val="Hyperlink"/>
+          </w:rPr>
+          <w:t xml:space="preserve"> </w:t>
+        </w:r>
+        <w:r>
+          <w:rPr>
+            <w:rStyle w:val="Hyperlink"/>
+          </w:rPr>
+          <w:t xml:space="preserve">(</w:t>
+        </w:r>
+        <w:r>
+          <w:rPr>
+            <w:rStyle w:val="Hyperlink"/>
+            <w:i/>
+            <w:iCs/>
+          </w:rPr>
+          <w:t xml:space="preserve">Aeon Ideas</w:t>
+        </w:r>
+        <w:r>
+          <w:rPr>
+            <w:rStyle w:val="Hyperlink"/>
+          </w:rPr>
+          <w:t xml:space="preserve">)</w:t>
+        </w:r>
+      </w:hyperlink>
+      <w:r>
+        <w:t xml:space="preserve">.</w:t>
       </w:r>
     </w:p>
     <w:p>
       <w:pPr>
         <w:pStyle w:val="BodyText"/>
-      </w:pPr>
-      <w:r>
-        <w:rPr>
-          <w:b/>
-          <w:bCs/>
-        </w:rPr>
-        <w:t xml:space="preserve">Recommended</w:t>
-      </w:r>
-      <w:r>
-        <w:t xml:space="preserve">:</w:t>
-      </w:r>
-      <w:r>
-        <w:t xml:space="preserve"> </w:t>
-      </w:r>
-      <w:hyperlink r:id="rId98">
-        <w:r>
-          <w:rPr>
-            <w:rStyle w:val="Hyperlink"/>
-          </w:rPr>
-          <w:t xml:space="preserve">Locke, II.xxvii, §§9–26 entire</w:t>
-        </w:r>
-      </w:hyperlink>
-      <w:r>
-        <w:t xml:space="preserve">, for anyone who wants to see the details of Locke’s view in a more original form.</w:t>
-      </w:r>
-    </w:p>
-    <w:bookmarkEnd w:id="101"/>
-    <w:bookmarkEnd w:id="102"/>
-    <w:bookmarkStart w:id="107" w:name="week-13-law"/>
-    <w:p>
-      <w:pPr>
-        <w:pStyle w:val="Heading2"/>
-      </w:pPr>
-      <w:r>
-        <w:t xml:space="preserve">Week 13: Law</w:t>
-      </w:r>
-    </w:p>
-    <w:p>
-      <w:pPr>
-        <w:pStyle w:val="FirstParagraph"/>
       </w:pPr>
       <w:r>
         <w:rPr>
           <w:i/>
           <w:iCs/>
         </w:rPr>
-        <w:t xml:space="preserve">Essay due Monday, November 23.</w:t>
-      </w:r>
-    </w:p>
-    <w:bookmarkStart w:id="105" w:name="Xa4bb28432e14a88f4742351691505a49b1698c4"/>
+        <w:t xml:space="preserve">Module Quiz 4 (Lectures 22–27) opens after class, due Friday.</w:t>
+      </w:r>
+    </w:p>
+    <w:bookmarkEnd w:id="117"/>
+    <w:bookmarkStart w:id="118" w:name="thursday-december-10-lecture-28-review"/>
     <w:p>
       <w:pPr>
         <w:pStyle w:val="Heading3"/>
       </w:pPr>
       <w:r>
-        <w:t xml:space="preserve">Tuesday, November 24 (Lecture 24) — Why obey the law?</w:t>
+        <w:t xml:space="preserve">Thursday, December 10 (Lecture 28) — Review</w:t>
       </w:r>
     </w:p>
     <w:p>
@@ -3711,48 +4117,7 @@
         <w:pStyle w:val="FirstParagraph"/>
       </w:pPr>
       <w:r>
-        <w:rPr>
-          <w:b/>
-          <w:bCs/>
-        </w:rPr>
-        <w:t xml:space="preserve">Required</w:t>
-      </w:r>
-      <w:r>
-        <w:t xml:space="preserve">: John Protavi,</w:t>
-      </w:r>
-      <w:r>
-        <w:t xml:space="preserve"> </w:t>
-      </w:r>
-      <w:hyperlink r:id="rId103">
-        <w:r>
-          <w:rPr>
-            <w:rStyle w:val="Hyperlink"/>
-          </w:rPr>
-          <w:t xml:space="preserve">“Plato’s</w:t>
-        </w:r>
-        <w:r>
-          <w:rPr>
-            <w:rStyle w:val="Hyperlink"/>
-          </w:rPr>
-          <w:t xml:space="preserve"> </w:t>
-        </w:r>
-        <w:r>
-          <w:rPr>
-            <w:rStyle w:val="Hyperlink"/>
-            <w:i/>
-            <w:iCs/>
-          </w:rPr>
-          <w:t xml:space="preserve">Crito</w:t>
-        </w:r>
-        <w:r>
-          <w:rPr>
-            <w:rStyle w:val="Hyperlink"/>
-          </w:rPr>
-          <w:t xml:space="preserve">”</w:t>
-        </w:r>
-      </w:hyperlink>
-      <w:r>
-        <w:t xml:space="preserve">. Read this first.</w:t>
+        <w:t xml:space="preserve">No reading. Bring questions.</w:t>
       </w:r>
     </w:p>
     <w:p>
@@ -3760,339 +4125,39 @@
         <w:pStyle w:val="BodyText"/>
       </w:pPr>
       <w:r>
-        <w:rPr>
-          <w:b/>
-          <w:bCs/>
-        </w:rPr>
-        <w:t xml:space="preserve">Required</w:t>
-      </w:r>
-      <w:r>
-        <w:t xml:space="preserve">: Plato,</w:t>
-      </w:r>
-      <w:r>
-        <w:t xml:space="preserve"> </w:t>
-      </w:r>
-      <w:hyperlink r:id="rId104">
-        <w:r>
-          <w:rPr>
-            <w:rStyle w:val="Hyperlink"/>
-            <w:i/>
-            <w:iCs/>
-          </w:rPr>
-          <w:t xml:space="preserve">Crito</w:t>
-        </w:r>
-      </w:hyperlink>
-      <w:r>
-        <w:t xml:space="preserve">. (Jowett translation, Project Gutenberg)</w:t>
-      </w:r>
-    </w:p>
-    <w:bookmarkEnd w:id="105"/>
-    <w:bookmarkStart w:id="106" w:name="X1409287e655faaa706d560809809ecb7d412b48"/>
-    <w:p>
-      <w:pPr>
-        <w:pStyle w:val="Heading3"/>
-      </w:pPr>
-      <w:r>
-        <w:t xml:space="preserve">Thursday, November 26 — Thanksgiving recess, no class</w:t>
-      </w:r>
-    </w:p>
-    <w:bookmarkEnd w:id="106"/>
-    <w:bookmarkEnd w:id="107"/>
-    <w:bookmarkStart w:id="114" w:name="week-14-punishment-and-speech"/>
-    <w:p>
-      <w:pPr>
-        <w:pStyle w:val="Heading2"/>
-      </w:pPr>
-      <w:r>
-        <w:t xml:space="preserve">Week 14: Punishment and Speech</w:t>
-      </w:r>
-    </w:p>
-    <w:bookmarkStart w:id="110" w:name="X79a81136425caf0487efa9b62b3f24f30bbda61"/>
-    <w:p>
-      <w:pPr>
-        <w:pStyle w:val="Heading3"/>
-      </w:pPr>
-      <w:r>
-        <w:t xml:space="preserve">Tuesday, December 01 (Lecture 25) — Theories of punishment</w:t>
+        <w:t xml:space="preserve">The final examination is in the University examination period, 14–21 December. The date and room will be posted once the University publishes the schedule.</w:t>
+      </w:r>
+    </w:p>
+    <w:p>
+      <w:r>
+        <w:br w:type="page"/>
+      </w:r>
+    </w:p>
+    <w:bookmarkEnd w:id="118"/>
+    <w:bookmarkEnd w:id="119"/>
+    <w:bookmarkEnd w:id="120"/>
+    <w:bookmarkStart w:id="123" w:name="open-for-the-gsi-meeting"/>
+    <w:p>
+      <w:pPr>
+        <w:pStyle w:val="Heading1"/>
+      </w:pPr>
+      <w:r>
+        <w:t xml:space="preserve">Open for the GSI meeting</w:t>
       </w:r>
     </w:p>
     <w:p>
       <w:pPr>
         <w:pStyle w:val="FirstParagraph"/>
-      </w:pPr>
-      <w:r>
-        <w:rPr>
-          <w:b/>
-          <w:bCs/>
-        </w:rPr>
-        <w:t xml:space="preserve">Required</w:t>
-      </w:r>
-      <w:r>
-        <w:t xml:space="preserve">: Travis Joseph Rodgers,</w:t>
-      </w:r>
-      <w:r>
-        <w:t xml:space="preserve"> </w:t>
-      </w:r>
-      <w:hyperlink r:id="rId108">
-        <w:r>
-          <w:rPr>
-            <w:rStyle w:val="Hyperlink"/>
-          </w:rPr>
-          <w:t xml:space="preserve">“Theories of Punishment”</w:t>
-        </w:r>
-      </w:hyperlink>
-      <w:r>
-        <w:t xml:space="preserve"> </w:t>
-      </w:r>
-      <w:r>
-        <w:t xml:space="preserve">(1000-Word Philosophy).</w:t>
-      </w:r>
-    </w:p>
-    <w:p>
-      <w:pPr>
-        <w:pStyle w:val="BodyText"/>
-      </w:pPr>
-      <w:r>
-        <w:rPr>
-          <w:b/>
-          <w:bCs/>
-        </w:rPr>
-        <w:t xml:space="preserve">Recommended</w:t>
-      </w:r>
-      <w:r>
-        <w:t xml:space="preserve">: SEP,</w:t>
-      </w:r>
-      <w:r>
-        <w:t xml:space="preserve"> </w:t>
-      </w:r>
-      <w:hyperlink r:id="rId109">
-        <w:r>
-          <w:rPr>
-            <w:rStyle w:val="Hyperlink"/>
-          </w:rPr>
-          <w:t xml:space="preserve">“Legal Punishment”</w:t>
-        </w:r>
-      </w:hyperlink>
-      <w:r>
-        <w:t xml:space="preserve">, the consequentialist and retributivist sections.</w:t>
-      </w:r>
-    </w:p>
-    <w:bookmarkEnd w:id="110"/>
-    <w:bookmarkStart w:id="113" w:name="X9a2df436863387c404aa2d0a9ac8b7fb026d883"/>
-    <w:p>
-      <w:pPr>
-        <w:pStyle w:val="Heading3"/>
-      </w:pPr>
-      <w:r>
-        <w:t xml:space="preserve">Thursday, December 03 (Lecture 26) — Free speech and the marketplace of ideas</w:t>
-      </w:r>
-    </w:p>
-    <w:p>
-      <w:pPr>
-        <w:pStyle w:val="FirstParagraph"/>
-      </w:pPr>
-      <w:r>
-        <w:rPr>
-          <w:b/>
-          <w:bCs/>
-        </w:rPr>
-        <w:t xml:space="preserve">Required</w:t>
-      </w:r>
-      <w:r>
-        <w:t xml:space="preserve">: Mark Satta,</w:t>
-      </w:r>
-      <w:r>
-        <w:t xml:space="preserve"> </w:t>
-      </w:r>
-      <w:hyperlink r:id="rId111">
-        <w:r>
-          <w:rPr>
-            <w:rStyle w:val="Hyperlink"/>
-          </w:rPr>
-          <w:t xml:space="preserve">“Free Speech”</w:t>
-        </w:r>
-      </w:hyperlink>
-      <w:r>
-        <w:t xml:space="preserve"> </w:t>
-      </w:r>
-      <w:r>
-        <w:t xml:space="preserve">(1000-Word Philosophy)</w:t>
-      </w:r>
-    </w:p>
-    <w:p>
-      <w:pPr>
-        <w:pStyle w:val="BodyText"/>
-      </w:pPr>
-      <w:r>
-        <w:rPr>
-          <w:b/>
-          <w:bCs/>
-        </w:rPr>
-        <w:t xml:space="preserve">Required</w:t>
-      </w:r>
-      <w:r>
-        <w:t xml:space="preserve">: J. S. Mill and H. T. Mill,</w:t>
-      </w:r>
-      <w:r>
-        <w:t xml:space="preserve"> </w:t>
-      </w:r>
-      <w:hyperlink r:id="rId112">
-        <w:r>
-          <w:rPr>
-            <w:rStyle w:val="Hyperlink"/>
-            <w:i/>
-            <w:iCs/>
-          </w:rPr>
-          <w:t xml:space="preserve">On Liberty</w:t>
-        </w:r>
-      </w:hyperlink>
-      <w:r>
-        <w:t xml:space="preserve">, extract on Canvas.</w:t>
-      </w:r>
-    </w:p>
-    <w:bookmarkEnd w:id="113"/>
-    <w:bookmarkEnd w:id="114"/>
-    <w:bookmarkStart w:id="118" w:name="week-15-ending"/>
-    <w:p>
-      <w:pPr>
-        <w:pStyle w:val="Heading2"/>
-      </w:pPr>
-      <w:r>
-        <w:t xml:space="preserve">Week 15: Ending</w:t>
-      </w:r>
-    </w:p>
-    <w:bookmarkStart w:id="116" w:name="X743a790e5d5be054d57feee6607a1932d6cb600"/>
-    <w:p>
-      <w:pPr>
-        <w:pStyle w:val="Heading3"/>
-      </w:pPr>
-      <w:r>
-        <w:t xml:space="preserve">Tuesday, December 08 (Lecture 27) — Does the marketplace track truth?</w:t>
-      </w:r>
-    </w:p>
-    <w:p>
-      <w:pPr>
-        <w:pStyle w:val="FirstParagraph"/>
-      </w:pPr>
-      <w:r>
-        <w:rPr>
-          <w:b/>
-          <w:bCs/>
-        </w:rPr>
-        <w:t xml:space="preserve">Required</w:t>
-      </w:r>
-      <w:r>
-        <w:t xml:space="preserve">: David V. Johnson,</w:t>
-      </w:r>
-      <w:r>
-        <w:t xml:space="preserve"> </w:t>
-      </w:r>
-      <w:hyperlink r:id="rId115">
-        <w:r>
-          <w:rPr>
-            <w:rStyle w:val="Hyperlink"/>
-          </w:rPr>
-          <w:t xml:space="preserve">“How do we pry apart the true and compelling from the false and toxic?”</w:t>
-        </w:r>
-        <w:r>
-          <w:rPr>
-            <w:rStyle w:val="Hyperlink"/>
-          </w:rPr>
-          <w:t xml:space="preserve"> </w:t>
-        </w:r>
-        <w:r>
-          <w:rPr>
-            <w:rStyle w:val="Hyperlink"/>
-          </w:rPr>
-          <w:t xml:space="preserve">(</w:t>
-        </w:r>
-        <w:r>
-          <w:rPr>
-            <w:rStyle w:val="Hyperlink"/>
-            <w:i/>
-            <w:iCs/>
-          </w:rPr>
-          <w:t xml:space="preserve">Aeon Ideas</w:t>
-        </w:r>
-        <w:r>
-          <w:rPr>
-            <w:rStyle w:val="Hyperlink"/>
-          </w:rPr>
-          <w:t xml:space="preserve">)</w:t>
-        </w:r>
-      </w:hyperlink>
-      <w:r>
-        <w:t xml:space="preserve">.</w:t>
-      </w:r>
-    </w:p>
-    <w:p>
-      <w:pPr>
-        <w:pStyle w:val="BodyText"/>
       </w:pPr>
       <w:r>
         <w:rPr>
           <w:i/>
           <w:iCs/>
         </w:rPr>
-        <w:t xml:space="preserve">Module Quiz 4 (Lectures 22–27) opens after class, due Friday.</w:t>
-      </w:r>
-    </w:p>
-    <w:bookmarkEnd w:id="116"/>
-    <w:bookmarkStart w:id="117" w:name="thursday-december-10-lecture-28-review"/>
-    <w:p>
-      <w:pPr>
-        <w:pStyle w:val="Heading3"/>
-      </w:pPr>
-      <w:r>
-        <w:t xml:space="preserve">Thursday, December 10 (Lecture 28) — Review</w:t>
-      </w:r>
-    </w:p>
-    <w:p>
-      <w:pPr>
-        <w:pStyle w:val="FirstParagraph"/>
-      </w:pPr>
-      <w:r>
-        <w:t xml:space="preserve">No reading. Bring questions.</w:t>
-      </w:r>
-    </w:p>
-    <w:p>
-      <w:pPr>
-        <w:pStyle w:val="BodyText"/>
-      </w:pPr>
-      <w:r>
-        <w:t xml:space="preserve">The final examination is in the University examination period, 14–21 December. The date and room will be posted once the University publishes the schedule.</w:t>
-      </w:r>
-    </w:p>
-    <w:p>
-      <w:r>
-        <w:br w:type="page"/>
-      </w:r>
-    </w:p>
-    <w:bookmarkEnd w:id="117"/>
-    <w:bookmarkEnd w:id="118"/>
-    <w:bookmarkEnd w:id="119"/>
-    <w:bookmarkStart w:id="122" w:name="open-for-the-gsi-meeting"/>
-    <w:p>
-      <w:pPr>
-        <w:pStyle w:val="Heading1"/>
-      </w:pPr>
-      <w:r>
-        <w:t xml:space="preserve">Open for the GSI meeting</w:t>
-      </w:r>
-    </w:p>
-    <w:p>
-      <w:pPr>
-        <w:pStyle w:val="FirstParagraph"/>
-      </w:pPr>
-      <w:r>
-        <w:rPr>
-          <w:i/>
-          <w:iCs/>
-        </w:rPr>
         <w:t xml:space="preserve">This section is not for students. Delete it before the syllabus goes out.</w:t>
       </w:r>
     </w:p>
-    <w:bookmarkStart w:id="120" w:name="the-section-component"/>
+    <w:bookmarkStart w:id="121" w:name="the-section-component"/>
     <w:p>
       <w:pPr>
         <w:pStyle w:val="Heading2"/>
@@ -4169,8 +4234,8 @@
         <w:t xml:space="preserve">be best to be uniform across the sections, but I’m willing to be talked out of it.</w:t>
       </w:r>
     </w:p>
-    <w:bookmarkEnd w:id="120"/>
-    <w:bookmarkStart w:id="121" w:name="Xf660aefd2a59bc7f4248464b5e42510079fc03f"/>
+    <w:bookmarkEnd w:id="121"/>
+    <w:bookmarkStart w:id="122" w:name="Xf660aefd2a59bc7f4248464b5e42510079fc03f"/>
     <w:p>
       <w:pPr>
         <w:pStyle w:val="Heading2"/>
@@ -4235,8 +4300,8 @@
         <w:t xml:space="preserve">Short Answer 1 is meant to be in class, and this could cause accommodations complications. We should flag this early, and get on top of any issues. The same goes for any other in class writing assignments you want to do. Also, you might want to schedule a makeup slot - preferably one slot across all six sections, because out of 150 we will always have some crises.</w:t>
       </w:r>
     </w:p>
-    <w:bookmarkEnd w:id="121"/>
     <w:bookmarkEnd w:id="122"/>
+    <w:bookmarkEnd w:id="123"/>
     <w:sectPr>
       <w:footnotePr>
         <w:numRestart w:val="eachSect"/>

</xml_diff>